<commit_message>
Docs update and tasks fixes
</commit_message>
<xml_diff>
--- a/_docs/assignment.docx
+++ b/_docs/assignment.docx
@@ -33,7 +33,10 @@
         <w:br/>
       </w:r>
       <w:r>
-        <w:t>Tiny Transformers, Tiny Stories</w:t>
+        <w:t>Tiny Transformers</w:t>
+      </w:r>
+      <w:r>
+        <w:t xml:space="preserve"> on PULP Platforms</w:t>
       </w:r>
     </w:p>
     <w:p>
@@ -45,58 +48,15 @@
           <w:szCs w:val="20"/>
         </w:rPr>
       </w:pPr>
-      <w:r>
-        <w:rPr>
-          <w:noProof/>
+    </w:p>
+    <w:p>
+      <w:pPr>
+        <w:spacing w:before="0" w:line="240" w:lineRule="auto"/>
+        <w:rPr>
           <w:color w:val="666666"/>
           <w:sz w:val="20"/>
           <w:szCs w:val="20"/>
         </w:rPr>
-        <w:drawing>
-          <wp:inline distT="114300" distB="114300" distL="114300" distR="114300" wp14:anchorId="2FCC2586" wp14:editId="2FCC2587">
-            <wp:extent cx="447675" cy="57150"/>
-            <wp:effectExtent l="0" t="0" r="0" b="0"/>
-            <wp:docPr id="3" name="image1.png" descr="short line"/>
-            <wp:cNvGraphicFramePr/>
-            <a:graphic xmlns:a="http://schemas.openxmlformats.org/drawingml/2006/main">
-              <a:graphicData uri="http://schemas.openxmlformats.org/drawingml/2006/picture">
-                <pic:pic xmlns:pic="http://schemas.openxmlformats.org/drawingml/2006/picture">
-                  <pic:nvPicPr>
-                    <pic:cNvPr id="0" name="image1.png" descr="short line"/>
-                    <pic:cNvPicPr preferRelativeResize="0"/>
-                  </pic:nvPicPr>
-                  <pic:blipFill>
-                    <a:blip r:embed="rId7"/>
-                    <a:srcRect/>
-                    <a:stretch>
-                      <a:fillRect/>
-                    </a:stretch>
-                  </pic:blipFill>
-                  <pic:spPr>
-                    <a:xfrm>
-                      <a:off x="0" y="0"/>
-                      <a:ext cx="447675" cy="57150"/>
-                    </a:xfrm>
-                    <a:prstGeom prst="rect">
-                      <a:avLst/>
-                    </a:prstGeom>
-                    <a:ln/>
-                  </pic:spPr>
-                </pic:pic>
-              </a:graphicData>
-            </a:graphic>
-          </wp:inline>
-        </w:drawing>
-      </w:r>
-    </w:p>
-    <w:p>
-      <w:pPr>
-        <w:spacing w:before="0" w:line="240" w:lineRule="auto"/>
-        <w:rPr>
-          <w:color w:val="666666"/>
-          <w:sz w:val="20"/>
-          <w:szCs w:val="20"/>
-        </w:rPr>
       </w:pPr>
     </w:p>
     <w:p>
@@ -104,19 +64,25 @@
         <w:spacing w:before="0"/>
         <w:rPr>
           <w:i/>
+          <w:sz w:val="22"/>
+          <w:szCs w:val="22"/>
           <w:lang w:val="it-IT"/>
         </w:rPr>
       </w:pPr>
       <w:r>
         <w:rPr>
           <w:i/>
+          <w:sz w:val="22"/>
+          <w:szCs w:val="22"/>
           <w:lang w:val="it-IT"/>
         </w:rPr>
-        <w:t xml:space="preserve">Authors:  </w:t>
-      </w:r>
-      <w:r>
-        <w:rPr>
-          <w:i/>
+        <w:t xml:space="preserve">Authors: </w:t>
+      </w:r>
+      <w:r>
+        <w:rPr>
+          <w:i/>
+          <w:sz w:val="22"/>
+          <w:szCs w:val="22"/>
           <w:lang w:val="it-IT"/>
         </w:rPr>
         <w:t xml:space="preserve">Călin Diaconu, </w:t>
@@ -124,6 +90,8 @@
       <w:r>
         <w:rPr>
           <w:i/>
+          <w:sz w:val="22"/>
+          <w:szCs w:val="22"/>
           <w:lang w:val="it-IT"/>
         </w:rPr>
         <w:t>Luca Bompani, Davide Nadalini, Alberto Dequino, Francesco Conti</w:t>
@@ -143,7 +111,7 @@
         </w:rPr>
         <w:t xml:space="preserve">Contacts: </w:t>
       </w:r>
-      <w:hyperlink r:id="rId8" w:history="1">
+      <w:hyperlink r:id="rId7" w:history="1">
         <w:r>
           <w:rPr>
             <w:rStyle w:val="Hyperlink"/>
@@ -158,7 +126,7 @@
         </w:rPr>
         <w:t xml:space="preserve">, </w:t>
       </w:r>
-      <w:hyperlink r:id="rId9" w:history="1">
+      <w:hyperlink r:id="rId8" w:history="1">
         <w:r>
           <w:rPr>
             <w:rStyle w:val="Hyperlink"/>
@@ -166,6 +134,27 @@
             <w:lang w:val="en-US"/>
           </w:rPr>
           <w:t>seyedahmad.mirsalar2@unibo.it</w:t>
+        </w:r>
+      </w:hyperlink>
+      <w:r>
+        <w:rPr>
+          <w:i/>
+        </w:rPr>
+        <w:t>,</w:t>
+      </w:r>
+      <w:r>
+        <w:rPr>
+          <w:i/>
+        </w:rPr>
+        <w:t xml:space="preserve"> </w:t>
+      </w:r>
+      <w:hyperlink r:id="rId9" w:history="1">
+        <w:r>
+          <w:rPr>
+            <w:rStyle w:val="Hyperlink"/>
+            <w:i/>
+          </w:rPr>
+          <w:t>angelo.anzalone4@unibo.it</w:t>
         </w:r>
       </w:hyperlink>
       <w:r>
@@ -326,7 +315,7 @@
       </w:pPr>
       <w:proofErr w:type="spellStart"/>
       <w:r>
-        <w:t>LLama</w:t>
+        <w:t>LLaMA</w:t>
       </w:r>
       <w:proofErr w:type="spellEnd"/>
       <w:r>
@@ -497,7 +486,30 @@
           <w:sz w:val="22"/>
           <w:szCs w:val="22"/>
         </w:rPr>
-        <w:t>You will deliver ONLY THIS TEXT FILE, no code</w:t>
+        <w:t>You will deliver ONLY THIS TEXT FILE,</w:t>
+      </w:r>
+      <w:r>
+        <w:rPr>
+          <w:sz w:val="22"/>
+          <w:szCs w:val="22"/>
+        </w:rPr>
+        <w:t xml:space="preserve"> </w:t>
+      </w:r>
+      <w:r>
+        <w:rPr>
+          <w:b/>
+          <w:bCs/>
+          <w:sz w:val="22"/>
+          <w:szCs w:val="22"/>
+        </w:rPr>
+        <w:t>TRANSFORMED INTO PDF</w:t>
+      </w:r>
+      <w:r>
+        <w:rPr>
+          <w:sz w:val="22"/>
+          <w:szCs w:val="22"/>
+        </w:rPr>
+        <w:t xml:space="preserve"> no code</w:t>
       </w:r>
     </w:p>
     <w:p>
@@ -556,7 +568,14 @@
           <w:sz w:val="22"/>
           <w:szCs w:val="22"/>
         </w:rPr>
-        <w:t xml:space="preserve">Export to pdf format. </w:t>
+        <w:t>Export to PDF format</w:t>
+      </w:r>
+      <w:r>
+        <w:rPr>
+          <w:sz w:val="22"/>
+          <w:szCs w:val="22"/>
+        </w:rPr>
+        <w:t xml:space="preserve">. </w:t>
       </w:r>
     </w:p>
     <w:p>
@@ -711,19 +730,7 @@
           <w:b/>
         </w:rPr>
         <w:lastRenderedPageBreak/>
-        <w:t>Task 1</w:t>
-      </w:r>
-      <w:r>
-        <w:rPr>
-          <w:b/>
-        </w:rPr>
-        <w:t>.</w:t>
-      </w:r>
-      <w:r>
-        <w:rPr>
-          <w:b/>
-        </w:rPr>
-        <w:t xml:space="preserve"> Attention</w:t>
+        <w:t>Task 1 – Attention</w:t>
       </w:r>
     </w:p>
     <w:p>
@@ -731,16 +738,10 @@
         <w:pStyle w:val="Heading2"/>
       </w:pPr>
       <w:r>
-        <w:t xml:space="preserve">Task </w:t>
-      </w:r>
-      <w:r>
-        <w:t>1.1</w:t>
-      </w:r>
-      <w:r>
-        <w:t>.</w:t>
-      </w:r>
-      <w:r>
-        <w:t xml:space="preserve"> Size of the Q, K and V weights</w:t>
+        <w:t>Task 1.1 – Size</w:t>
+      </w:r>
+      <w:r>
+        <w:t xml:space="preserve"> of the Q, K and V weights</w:t>
       </w:r>
     </w:p>
     <w:p>
@@ -783,7 +784,7 @@
             <w:rPr>
               <w:rFonts w:ascii="Cambria Math" w:hAnsi="Cambria Math"/>
             </w:rPr>
-            <m:t xml:space="preserve"> =dim*dim *</m:t>
+            <m:t xml:space="preserve"> =DIM*DIM *</m:t>
           </m:r>
           <m:f>
             <m:fPr>
@@ -794,58 +795,20 @@
               </m:ctrlPr>
             </m:fPr>
             <m:num>
-              <m:sSup>
-                <m:sSupPr>
-                  <m:ctrlPr>
-                    <w:rPr>
-                      <w:rFonts w:ascii="Cambria Math" w:hAnsi="Cambria Math"/>
-                    </w:rPr>
-                  </m:ctrlPr>
-                </m:sSupPr>
-                <m:e>
-                  <m:r>
-                    <w:rPr>
-                      <w:rFonts w:ascii="Cambria Math" w:hAnsi="Cambria Math"/>
-                    </w:rPr>
-                    <m:t>N</m:t>
-                  </m:r>
-                </m:e>
-                <m:sup>
-                  <m:r>
-                    <w:rPr>
-                      <w:rFonts w:ascii="Cambria Math" w:hAnsi="Cambria Math"/>
-                    </w:rPr>
-                    <m:t>H</m:t>
-                  </m:r>
-                </m:sup>
-              </m:sSup>
+              <m:r>
+                <w:rPr>
+                  <w:rFonts w:ascii="Cambria Math" w:hAnsi="Cambria Math"/>
+                </w:rPr>
+                <m:t>N_HEADS</m:t>
+              </m:r>
             </m:num>
             <m:den>
-              <m:sSup>
-                <m:sSupPr>
-                  <m:ctrlPr>
-                    <w:rPr>
-                      <w:rFonts w:ascii="Cambria Math" w:hAnsi="Cambria Math"/>
-                    </w:rPr>
-                  </m:ctrlPr>
-                </m:sSupPr>
-                <m:e>
-                  <m:r>
-                    <w:rPr>
-                      <w:rFonts w:ascii="Cambria Math" w:hAnsi="Cambria Math"/>
-                    </w:rPr>
-                    <m:t>N</m:t>
-                  </m:r>
-                </m:e>
-                <m:sup>
-                  <m:r>
-                    <w:rPr>
-                      <w:rFonts w:ascii="Cambria Math" w:hAnsi="Cambria Math"/>
-                    </w:rPr>
-                    <m:t>H</m:t>
-                  </m:r>
-                </m:sup>
-              </m:sSup>
+              <m:r>
+                <w:rPr>
+                  <w:rFonts w:ascii="Cambria Math" w:hAnsi="Cambria Math"/>
+                </w:rPr>
+                <m:t>N_HEADS</m:t>
+              </m:r>
             </m:den>
           </m:f>
           <m:r>
@@ -883,76 +846,7 @@
             <w:rPr>
               <w:rFonts w:ascii="Cambria Math" w:hAnsi="Cambria Math"/>
             </w:rPr>
-            <m:t xml:space="preserve"> =dim*dim * </m:t>
-          </m:r>
-          <m:f>
-            <m:fPr>
-              <m:ctrlPr>
-                <w:rPr>
-                  <w:rFonts w:ascii="Cambria Math" w:hAnsi="Cambria Math"/>
-                </w:rPr>
-              </m:ctrlPr>
-            </m:fPr>
-            <m:num>
-              <m:sSup>
-                <m:sSupPr>
-                  <m:ctrlPr>
-                    <w:rPr>
-                      <w:rFonts w:ascii="Cambria Math" w:hAnsi="Cambria Math"/>
-                    </w:rPr>
-                  </m:ctrlPr>
-                </m:sSupPr>
-                <m:e>
-                  <m:r>
-                    <w:rPr>
-                      <w:rFonts w:ascii="Cambria Math" w:hAnsi="Cambria Math"/>
-                    </w:rPr>
-                    <m:t>N</m:t>
-                  </m:r>
-                </m:e>
-                <m:sup>
-                  <m:r>
-                    <w:rPr>
-                      <w:rFonts w:ascii="Cambria Math" w:hAnsi="Cambria Math"/>
-                    </w:rPr>
-                    <m:t>KV</m:t>
-                  </m:r>
-                </m:sup>
-              </m:sSup>
-            </m:num>
-            <m:den>
-              <m:sSup>
-                <m:sSupPr>
-                  <m:ctrlPr>
-                    <w:rPr>
-                      <w:rFonts w:ascii="Cambria Math" w:hAnsi="Cambria Math"/>
-                    </w:rPr>
-                  </m:ctrlPr>
-                </m:sSupPr>
-                <m:e>
-                  <m:r>
-                    <w:rPr>
-                      <w:rFonts w:ascii="Cambria Math" w:hAnsi="Cambria Math"/>
-                    </w:rPr>
-                    <m:t>N</m:t>
-                  </m:r>
-                </m:e>
-                <m:sup>
-                  <m:r>
-                    <w:rPr>
-                      <w:rFonts w:ascii="Cambria Math" w:hAnsi="Cambria Math"/>
-                    </w:rPr>
-                    <m:t>H</m:t>
-                  </m:r>
-                </m:sup>
-              </m:sSup>
-            </m:den>
-          </m:f>
-          <m:r>
-            <w:rPr>
-              <w:rFonts w:ascii="Cambria Math" w:hAnsi="Cambria Math"/>
-            </w:rPr>
-            <m:t>,  </m:t>
+            <m:t xml:space="preserve"> =</m:t>
           </m:r>
           <m:sSup>
             <m:sSupPr>
@@ -975,7 +869,7 @@
                 <w:rPr>
                   <w:rFonts w:ascii="Cambria Math" w:hAnsi="Cambria Math"/>
                 </w:rPr>
-                <m:t>v</m:t>
+                <m:t>V</m:t>
               </m:r>
             </m:sup>
           </m:sSup>
@@ -983,7 +877,7 @@
             <w:rPr>
               <w:rFonts w:ascii="Cambria Math" w:hAnsi="Cambria Math"/>
             </w:rPr>
-            <m:t xml:space="preserve"> =dim*dim * </m:t>
+            <m:t xml:space="preserve">= DIM*DIM * </m:t>
           </m:r>
           <m:f>
             <m:fPr>
@@ -994,58 +888,20 @@
               </m:ctrlPr>
             </m:fPr>
             <m:num>
-              <m:sSup>
-                <m:sSupPr>
-                  <m:ctrlPr>
-                    <w:rPr>
-                      <w:rFonts w:ascii="Cambria Math" w:hAnsi="Cambria Math"/>
-                    </w:rPr>
-                  </m:ctrlPr>
-                </m:sSupPr>
-                <m:e>
-                  <m:r>
-                    <w:rPr>
-                      <w:rFonts w:ascii="Cambria Math" w:hAnsi="Cambria Math"/>
-                    </w:rPr>
-                    <m:t>N</m:t>
-                  </m:r>
-                </m:e>
-                <m:sup>
-                  <m:r>
-                    <w:rPr>
-                      <w:rFonts w:ascii="Cambria Math" w:hAnsi="Cambria Math"/>
-                    </w:rPr>
-                    <m:t>KV</m:t>
-                  </m:r>
-                </m:sup>
-              </m:sSup>
+              <m:r>
+                <w:rPr>
+                  <w:rFonts w:ascii="Cambria Math" w:hAnsi="Cambria Math"/>
+                </w:rPr>
+                <m:t>N_KV_HEADS</m:t>
+              </m:r>
             </m:num>
             <m:den>
-              <m:sSup>
-                <m:sSupPr>
-                  <m:ctrlPr>
-                    <w:rPr>
-                      <w:rFonts w:ascii="Cambria Math" w:hAnsi="Cambria Math"/>
-                    </w:rPr>
-                  </m:ctrlPr>
-                </m:sSupPr>
-                <m:e>
-                  <m:r>
-                    <w:rPr>
-                      <w:rFonts w:ascii="Cambria Math" w:hAnsi="Cambria Math"/>
-                    </w:rPr>
-                    <m:t>N</m:t>
-                  </m:r>
-                </m:e>
-                <m:sup>
-                  <m:r>
-                    <w:rPr>
-                      <w:rFonts w:ascii="Cambria Math" w:hAnsi="Cambria Math"/>
-                    </w:rPr>
-                    <m:t>H</m:t>
-                  </m:r>
-                </m:sup>
-              </m:sSup>
+              <m:r>
+                <w:rPr>
+                  <w:rFonts w:ascii="Cambria Math" w:hAnsi="Cambria Math"/>
+                </w:rPr>
+                <m:t>N_HEADS</m:t>
+              </m:r>
             </m:den>
           </m:f>
         </m:oMath>
@@ -1056,6 +912,327 @@
         <w:rPr>
           <w:b/>
           <w:i/>
+          <w:sz w:val="28"/>
+          <w:szCs w:val="28"/>
+        </w:rPr>
+      </w:pPr>
+      <w:r>
+        <w:rPr>
+          <w:b/>
+          <w:i/>
+          <w:sz w:val="28"/>
+          <w:szCs w:val="28"/>
+        </w:rPr>
+        <w:t>C</w:t>
+      </w:r>
+      <w:r>
+        <w:rPr>
+          <w:b/>
+          <w:i/>
+          <w:sz w:val="28"/>
+          <w:szCs w:val="28"/>
+        </w:rPr>
+        <w:t xml:space="preserve">alculate the size of each of these tensors </w:t>
+      </w:r>
+      <w:r>
+        <w:rPr>
+          <w:b/>
+          <w:i/>
+          <w:sz w:val="28"/>
+          <w:szCs w:val="28"/>
+        </w:rPr>
+        <w:t>for a single layer, as a number of elements</w:t>
+      </w:r>
+      <w:r>
+        <w:rPr>
+          <w:b/>
+          <w:i/>
+          <w:sz w:val="28"/>
+          <w:szCs w:val="28"/>
+        </w:rPr>
+        <w:t xml:space="preserve"> and memory needed (remember that we work with fp16 data)</w:t>
+      </w:r>
+      <w:r>
+        <w:rPr>
+          <w:b/>
+          <w:i/>
+          <w:sz w:val="28"/>
+          <w:szCs w:val="28"/>
+        </w:rPr>
+        <w:t xml:space="preserve">, </w:t>
+      </w:r>
+      <w:r>
+        <w:rPr>
+          <w:b/>
+          <w:i/>
+          <w:sz w:val="28"/>
+          <w:szCs w:val="28"/>
+        </w:rPr>
+        <w:t>using the formula above (the data values can be found in the conf_and_weights_fp16.h header file):</w:t>
+      </w:r>
+    </w:p>
+    <w:p>
+      <w:pPr>
+        <w:rPr>
+          <w:color w:val="FF0000"/>
+          <w:sz w:val="20"/>
+          <w:szCs w:val="20"/>
+        </w:rPr>
+      </w:pPr>
+      <w:r>
+        <w:rPr>
+          <w:b/>
+          <w:color w:val="FF0000"/>
+          <w:sz w:val="28"/>
+          <w:szCs w:val="28"/>
+        </w:rPr>
+        <w:t>[Your solution here]</w:t>
+      </w:r>
+    </w:p>
+    <w:p>
+      <w:pPr>
+        <w:rPr>
+          <w:color w:val="FF0000"/>
+        </w:rPr>
+      </w:pPr>
+    </w:p>
+    <w:p>
+      <w:pPr>
+        <w:rPr>
+          <w:b/>
+          <w:color w:val="039BE5"/>
+          <w:sz w:val="28"/>
+          <w:szCs w:val="28"/>
+        </w:rPr>
+      </w:pPr>
+      <w:r>
+        <w:br w:type="page"/>
+      </w:r>
+    </w:p>
+    <w:p>
+      <w:pPr>
+        <w:pStyle w:val="Heading2"/>
+      </w:pPr>
+      <w:r>
+        <w:lastRenderedPageBreak/>
+        <w:t>Task 1.2 – Moving</w:t>
+      </w:r>
+      <w:r>
+        <w:t xml:space="preserve"> the weights to L1 with the DMA</w:t>
+      </w:r>
+    </w:p>
+    <w:p>
+      <w:r>
+        <w:t>In the provided code, substitute the missing parts in the forward function.</w:t>
+      </w:r>
+      <w:r>
+        <w:t xml:space="preserve"> </w:t>
+      </w:r>
+      <w:r>
+        <w:t>These weights are stored</w:t>
+      </w:r>
+      <w:r>
+        <w:t xml:space="preserve"> in the </w:t>
+      </w:r>
+      <w:proofErr w:type="spellStart"/>
+      <w:r>
+        <w:rPr>
+          <w:rFonts w:ascii="Courier New" w:eastAsia="Courier New" w:hAnsi="Courier New" w:cs="Courier New"/>
+          <w:b/>
+          <w:i/>
+          <w:iCs/>
+          <w:sz w:val="23"/>
+          <w:szCs w:val="23"/>
+        </w:rPr>
+        <w:t>TransformerWeights</w:t>
+      </w:r>
+      <w:proofErr w:type="spellEnd"/>
+      <w:r>
+        <w:rPr>
+          <w:rFonts w:ascii="Courier New" w:eastAsia="Courier New" w:hAnsi="Courier New" w:cs="Courier New"/>
+          <w:b/>
+          <w:sz w:val="23"/>
+          <w:szCs w:val="23"/>
+        </w:rPr>
+        <w:t xml:space="preserve"> </w:t>
+      </w:r>
+      <w:r>
+        <w:t>data structure.</w:t>
+      </w:r>
+    </w:p>
+    <w:p>
+      <w:r>
+        <w:t>D</w:t>
+      </w:r>
+      <w:r>
+        <w:t xml:space="preserve">ata </w:t>
+      </w:r>
+      <w:r>
+        <w:t>must</w:t>
+      </w:r>
+      <w:r>
+        <w:t xml:space="preserve"> be moved into the </w:t>
+      </w:r>
+      <w:r>
+        <w:t>c</w:t>
+      </w:r>
+      <w:r>
+        <w:t xml:space="preserve">luster memory, called </w:t>
+      </w:r>
+      <w:proofErr w:type="gramStart"/>
+      <w:r>
+        <w:t>the L1</w:t>
+      </w:r>
+      <w:proofErr w:type="gramEnd"/>
+      <w:r>
+        <w:t xml:space="preserve">. To do so, we will use the Cluster DMA, which can move the data between the </w:t>
+      </w:r>
+      <w:r>
+        <w:t>system-level memory</w:t>
+      </w:r>
+      <w:r>
+        <w:t xml:space="preserve"> (L2) and the Cluster memory (L1). </w:t>
+      </w:r>
+    </w:p>
+    <w:p>
+      <w:r>
+        <w:t>Complete the code to move the weights for the Q, K and V projections in the L1 memory.</w:t>
+      </w:r>
+    </w:p>
+    <w:p>
+      <w:r>
+        <w:t xml:space="preserve">Note that the </w:t>
+      </w:r>
+      <w:r>
+        <w:t>K and V weights are stored in two separate arrays (</w:t>
+      </w:r>
+      <w:proofErr w:type="spellStart"/>
+      <w:r>
+        <w:rPr>
+          <w:i/>
+          <w:iCs/>
+        </w:rPr>
+        <w:t>wk</w:t>
+      </w:r>
+      <w:proofErr w:type="spellEnd"/>
+      <w:r>
+        <w:t xml:space="preserve"> and </w:t>
+      </w:r>
+      <w:proofErr w:type="spellStart"/>
+      <w:r>
+        <w:rPr>
+          <w:i/>
+          <w:iCs/>
+        </w:rPr>
+        <w:t>wv</w:t>
+      </w:r>
+      <w:proofErr w:type="spellEnd"/>
+      <w:r>
+        <w:t>), but they are loaded one after the other into the same L1 buffer (</w:t>
+      </w:r>
+      <w:r>
+        <w:rPr>
+          <w:i/>
+          <w:iCs/>
+        </w:rPr>
+        <w:t>BUFF_W_2</w:t>
+      </w:r>
+      <w:r>
+        <w:t>), reusing the same DMA command (</w:t>
+      </w:r>
+      <w:proofErr w:type="spellStart"/>
+      <w:r>
+        <w:rPr>
+          <w:i/>
+          <w:iCs/>
+        </w:rPr>
+        <w:t>kv_weight</w:t>
+      </w:r>
+      <w:proofErr w:type="spellEnd"/>
+      <w:r>
+        <w:t>): for the K transfer, only the source address has to change.</w:t>
+      </w:r>
+      <w:r>
+        <w:t xml:space="preserve"> </w:t>
+      </w:r>
+      <w:r>
+        <w:t>The Q weights use their own buffer (</w:t>
+      </w:r>
+      <w:r>
+        <w:rPr>
+          <w:i/>
+          <w:iCs/>
+        </w:rPr>
+        <w:t>BUFF_W_1</w:t>
+      </w:r>
+      <w:r>
+        <w:t>)</w:t>
+      </w:r>
+      <w:r>
+        <w:t>.</w:t>
+      </w:r>
+    </w:p>
+    <w:p>
+      <w:r>
+        <w:rPr>
+          <w:b/>
+          <w:bCs/>
+        </w:rPr>
+        <w:t>Hint</w:t>
+      </w:r>
+      <w:r>
+        <w:t xml:space="preserve">: Look for </w:t>
+      </w:r>
+      <w:r>
+        <w:rPr>
+          <w:b/>
+          <w:bCs/>
+        </w:rPr>
+        <w:t>“Task 1.2</w:t>
+      </w:r>
+      <w:r>
+        <w:rPr>
+          <w:b/>
+          <w:bCs/>
+        </w:rPr>
+        <w:t>”</w:t>
+      </w:r>
+      <w:r>
+        <w:rPr>
+          <w:b/>
+          <w:bCs/>
+        </w:rPr>
+        <w:t xml:space="preserve"> </w:t>
+      </w:r>
+      <w:r>
+        <w:rPr>
+          <w:b/>
+          <w:bCs/>
+        </w:rPr>
+        <w:t xml:space="preserve">comments in </w:t>
+      </w:r>
+      <w:proofErr w:type="spellStart"/>
+      <w:r>
+        <w:rPr>
+          <w:b/>
+          <w:bCs/>
+        </w:rPr>
+        <w:t>net.c</w:t>
+      </w:r>
+      <w:proofErr w:type="spellEnd"/>
+      <w:r>
+        <w:rPr>
+          <w:b/>
+          <w:bCs/>
+        </w:rPr>
+        <w:t>.</w:t>
+      </w:r>
+    </w:p>
+    <w:p/>
+    <w:p>
+      <w:pPr>
+        <w:rPr>
+          <w:b/>
           <w:sz w:val="32"/>
           <w:szCs w:val="32"/>
         </w:rPr>
@@ -1063,7 +1240,6 @@
       <w:r>
         <w:rPr>
           <w:b/>
-          <w:i/>
           <w:sz w:val="32"/>
           <w:szCs w:val="32"/>
         </w:rPr>
@@ -1072,355 +1248,30 @@
       <w:r>
         <w:rPr>
           <w:b/>
-          <w:i/>
           <w:sz w:val="32"/>
           <w:szCs w:val="32"/>
         </w:rPr>
-        <w:t xml:space="preserve">alculate the size of each of these tensors </w:t>
-      </w:r>
-      <w:r>
-        <w:rPr>
-          <w:b/>
-          <w:i/>
-          <w:sz w:val="32"/>
-          <w:szCs w:val="32"/>
-        </w:rPr>
-        <w:t xml:space="preserve">for a single layer, as </w:t>
-      </w:r>
-      <w:proofErr w:type="gramStart"/>
-      <w:r>
-        <w:rPr>
-          <w:b/>
-          <w:i/>
-          <w:sz w:val="32"/>
-          <w:szCs w:val="32"/>
-        </w:rPr>
-        <w:t>a number of</w:t>
-      </w:r>
-      <w:proofErr w:type="gramEnd"/>
-      <w:r>
-        <w:rPr>
-          <w:b/>
-          <w:i/>
-          <w:sz w:val="32"/>
-          <w:szCs w:val="32"/>
-        </w:rPr>
-        <w:t xml:space="preserve"> elements, </w:t>
-      </w:r>
-      <w:r>
-        <w:rPr>
-          <w:b/>
-          <w:i/>
-          <w:sz w:val="32"/>
-          <w:szCs w:val="32"/>
-        </w:rPr>
-        <w:t>using the formula above (the data values can be found in the conf_and_weights_fp16.h header file):</w:t>
-      </w:r>
-    </w:p>
-    <w:p>
-      <w:pPr>
-        <w:rPr>
-          <w:color w:val="FF0000"/>
-        </w:rPr>
-      </w:pPr>
-      <w:r>
+        <w:t>opy your code here:</w:t>
+      </w:r>
+    </w:p>
+    <w:p>
+      <w:pPr>
         <w:rPr>
           <w:b/>
           <w:color w:val="FF0000"/>
           <w:sz w:val="32"/>
           <w:szCs w:val="32"/>
         </w:rPr>
-        <w:t>Your solution here</w:t>
-      </w:r>
-    </w:p>
-    <w:p>
-      <w:pPr>
-        <w:rPr>
-          <w:color w:val="FF0000"/>
-        </w:rPr>
-      </w:pPr>
-    </w:p>
-    <w:p>
-      <w:pPr>
-        <w:rPr>
-          <w:b/>
-          <w:color w:val="039BE5"/>
-          <w:sz w:val="28"/>
-          <w:szCs w:val="28"/>
-        </w:rPr>
-      </w:pPr>
-      <w:r>
-        <w:br w:type="page"/>
-      </w:r>
-    </w:p>
-    <w:p>
-      <w:pPr>
-        <w:pStyle w:val="Heading2"/>
-      </w:pPr>
-    </w:p>
-    <w:p>
-      <w:pPr>
-        <w:pStyle w:val="Heading2"/>
-      </w:pPr>
-      <w:r>
-        <w:t>1.2 Moving the weights to L1 with the DMA</w:t>
-      </w:r>
-    </w:p>
-    <w:p>
-      <w:r>
-        <w:t>After computing the size of these weights, let’s implement their computation. In the provided code, substitute the missing parts in the forward function.</w:t>
-      </w:r>
-      <w:r>
-        <w:t xml:space="preserve"> </w:t>
-      </w:r>
-      <w:r>
-        <w:t xml:space="preserve">These weights are stored in the </w:t>
-      </w:r>
-      <w:proofErr w:type="spellStart"/>
-      <w:r>
-        <w:rPr>
-          <w:rFonts w:ascii="Courier New" w:eastAsia="Courier New" w:hAnsi="Courier New" w:cs="Courier New"/>
-          <w:b/>
-          <w:sz w:val="23"/>
-          <w:szCs w:val="23"/>
-        </w:rPr>
-        <w:t>TransformerWeights</w:t>
-      </w:r>
-      <w:proofErr w:type="spellEnd"/>
-      <w:r>
-        <w:rPr>
-          <w:rFonts w:ascii="Courier New" w:eastAsia="Courier New" w:hAnsi="Courier New" w:cs="Courier New"/>
-          <w:b/>
-          <w:sz w:val="23"/>
-          <w:szCs w:val="23"/>
-        </w:rPr>
-        <w:t xml:space="preserve"> </w:t>
-      </w:r>
-      <w:r>
-        <w:t xml:space="preserve">data structure. </w:t>
-      </w:r>
-      <w:proofErr w:type="gramStart"/>
-      <w:r>
-        <w:t>In order to</w:t>
-      </w:r>
-      <w:proofErr w:type="gramEnd"/>
-      <w:r>
-        <w:t xml:space="preserve"> execute the attention block, the data should be moved into the Cluster memory, called the L1. To do so, we will use the Cluster DMA, which can move the data between the system level memory (L2) and the Cluster memory (L1). </w:t>
-      </w:r>
-      <w:r>
-        <w:t xml:space="preserve">  </w:t>
-      </w:r>
-      <w:r>
-        <w:t xml:space="preserve">Complete the code in the </w:t>
-      </w:r>
-      <w:proofErr w:type="spellStart"/>
-      <w:r>
-        <w:rPr>
-          <w:b/>
-        </w:rPr>
-        <w:t>net.c</w:t>
-      </w:r>
-      <w:proofErr w:type="spellEnd"/>
-      <w:r>
-        <w:rPr>
-          <w:b/>
-        </w:rPr>
-        <w:t xml:space="preserve"> file</w:t>
-      </w:r>
-      <w:r>
-        <w:t xml:space="preserve"> to move the weights for the Q, K and V projections in the L1 memory. Note that the </w:t>
-      </w:r>
-      <w:r>
-        <w:t>K and V weights are stored in two separate arrays (</w:t>
-      </w:r>
-      <w:proofErr w:type="spellStart"/>
-      <w:r>
-        <w:t>wk</w:t>
-      </w:r>
-      <w:proofErr w:type="spellEnd"/>
-      <w:r>
-        <w:t xml:space="preserve"> and </w:t>
-      </w:r>
-      <w:proofErr w:type="spellStart"/>
-      <w:r>
-        <w:t>wv</w:t>
-      </w:r>
-      <w:proofErr w:type="spellEnd"/>
-      <w:r>
-        <w:t>), but they are loaded one after the other into the same L1 buffer (BUFF_W_2), reusing the same DMA command (</w:t>
-      </w:r>
-      <w:proofErr w:type="spellStart"/>
-      <w:r>
-        <w:t>kv_weight</w:t>
-      </w:r>
-      <w:proofErr w:type="spellEnd"/>
-      <w:r>
-        <w:t>): for the K transfer, only the source address has to change. The Q weights use their own buffer (BUFF_W_1)</w:t>
-      </w:r>
-      <w:r>
-        <w:t xml:space="preserve">.  </w:t>
-      </w:r>
-    </w:p>
-    <w:p>
-      <w:r>
-        <w:rPr>
-          <w:noProof/>
-        </w:rPr>
-        <w:drawing>
-          <wp:inline distT="114300" distB="114300" distL="114300" distR="114300" wp14:anchorId="2FCC2595" wp14:editId="203EF1FF">
-            <wp:extent cx="6286500" cy="1145280"/>
-            <wp:effectExtent l="0" t="0" r="0" b="0"/>
-            <wp:docPr id="17" name="image4.png"/>
-            <wp:cNvGraphicFramePr/>
-            <a:graphic xmlns:a="http://schemas.openxmlformats.org/drawingml/2006/main">
-              <a:graphicData uri="http://schemas.openxmlformats.org/drawingml/2006/picture">
-                <pic:pic xmlns:pic="http://schemas.openxmlformats.org/drawingml/2006/picture">
-                  <pic:nvPicPr>
-                    <pic:cNvPr id="0" name="image4.png"/>
-                    <pic:cNvPicPr preferRelativeResize="0"/>
-                  </pic:nvPicPr>
-                  <pic:blipFill>
-                    <a:blip r:embed="rId14"/>
-                    <a:srcRect/>
-                    <a:stretch>
-                      <a:fillRect/>
-                    </a:stretch>
-                  </pic:blipFill>
-                  <pic:spPr>
-                    <a:xfrm>
-                      <a:off x="0" y="0"/>
-                      <a:ext cx="6317831" cy="1150988"/>
-                    </a:xfrm>
-                    <a:prstGeom prst="rect">
-                      <a:avLst/>
-                    </a:prstGeom>
-                    <a:ln/>
-                  </pic:spPr>
-                </pic:pic>
-              </a:graphicData>
-            </a:graphic>
-          </wp:inline>
-        </w:drawing>
-      </w:r>
-      <w:r>
-        <w:rPr>
-          <w:noProof/>
-        </w:rPr>
-        <w:drawing>
-          <wp:inline distT="0" distB="0" distL="0" distR="0" wp14:anchorId="6D2344E7" wp14:editId="78D7DE9F">
-            <wp:extent cx="6497394" cy="1169670"/>
-            <wp:effectExtent l="0" t="0" r="0" b="0"/>
-            <wp:docPr id="614819830" name="Picture 4"/>
-            <wp:cNvGraphicFramePr>
-              <a:graphicFrameLocks xmlns:a="http://schemas.openxmlformats.org/drawingml/2006/main" noChangeAspect="1"/>
-            </wp:cNvGraphicFramePr>
-            <a:graphic xmlns:a="http://schemas.openxmlformats.org/drawingml/2006/main">
-              <a:graphicData uri="http://schemas.openxmlformats.org/drawingml/2006/picture">
-                <pic:pic xmlns:pic="http://schemas.openxmlformats.org/drawingml/2006/picture">
-                  <pic:nvPicPr>
-                    <pic:cNvPr id="614819830" name=""/>
-                    <pic:cNvPicPr/>
-                  </pic:nvPicPr>
-                  <pic:blipFill>
-                    <a:blip r:embed="rId15">
-                      <a:extLst>
-                        <a:ext uri="{28A0092B-C50C-407E-A947-70E740481C1C}">
-                          <a14:useLocalDpi xmlns:a14="http://schemas.microsoft.com/office/drawing/2010/main" val="0"/>
-                        </a:ext>
-                      </a:extLst>
-                    </a:blip>
-                    <a:stretch>
-                      <a:fillRect/>
-                    </a:stretch>
-                  </pic:blipFill>
-                  <pic:spPr>
-                    <a:xfrm>
-                      <a:off x="0" y="0"/>
-                      <a:ext cx="6497394" cy="1169670"/>
-                    </a:xfrm>
-                    <a:prstGeom prst="rect">
-                      <a:avLst/>
-                    </a:prstGeom>
-                  </pic:spPr>
-                </pic:pic>
-              </a:graphicData>
-            </a:graphic>
-          </wp:inline>
-        </w:drawing>
-      </w:r>
-      <w:r>
-        <w:rPr>
-          <w:noProof/>
-        </w:rPr>
-        <w:drawing>
-          <wp:inline distT="0" distB="0" distL="0" distR="0" wp14:anchorId="173E3A33" wp14:editId="2EB825E8">
-            <wp:extent cx="5940536" cy="1231265"/>
-            <wp:effectExtent l="0" t="0" r="3175" b="6985"/>
-            <wp:docPr id="1525910832" name="Picture 5"/>
-            <wp:cNvGraphicFramePr>
-              <a:graphicFrameLocks xmlns:a="http://schemas.openxmlformats.org/drawingml/2006/main" noChangeAspect="1"/>
-            </wp:cNvGraphicFramePr>
-            <a:graphic xmlns:a="http://schemas.openxmlformats.org/drawingml/2006/main">
-              <a:graphicData uri="http://schemas.openxmlformats.org/drawingml/2006/picture">
-                <pic:pic xmlns:pic="http://schemas.openxmlformats.org/drawingml/2006/picture">
-                  <pic:nvPicPr>
-                    <pic:cNvPr id="1525910832" name=""/>
-                    <pic:cNvPicPr/>
-                  </pic:nvPicPr>
-                  <pic:blipFill>
-                    <a:blip r:embed="rId16">
-                      <a:extLst>
-                        <a:ext uri="{28A0092B-C50C-407E-A947-70E740481C1C}">
-                          <a14:useLocalDpi xmlns:a14="http://schemas.microsoft.com/office/drawing/2010/main" val="0"/>
-                        </a:ext>
-                      </a:extLst>
-                    </a:blip>
-                    <a:stretch>
-                      <a:fillRect/>
-                    </a:stretch>
-                  </pic:blipFill>
-                  <pic:spPr>
-                    <a:xfrm>
-                      <a:off x="0" y="0"/>
-                      <a:ext cx="5940536" cy="1231265"/>
-                    </a:xfrm>
-                    <a:prstGeom prst="rect">
-                      <a:avLst/>
-                    </a:prstGeom>
-                  </pic:spPr>
-                </pic:pic>
-              </a:graphicData>
-            </a:graphic>
-          </wp:inline>
-        </w:drawing>
-      </w:r>
-    </w:p>
-    <w:p>
-      <w:pPr>
-        <w:rPr>
-          <w:b/>
-          <w:sz w:val="32"/>
-          <w:szCs w:val="32"/>
-        </w:rPr>
-      </w:pPr>
-      <w:r>
-        <w:rPr>
-          <w:b/>
-          <w:sz w:val="32"/>
-          <w:szCs w:val="32"/>
-        </w:rPr>
-        <w:t>Put a screenshot or copy your code here:</w:t>
-      </w:r>
-    </w:p>
-    <w:p>
-      <w:pPr>
+      </w:pPr>
+      <w:r>
         <w:rPr>
           <w:b/>
           <w:color w:val="FF0000"/>
           <w:sz w:val="32"/>
           <w:szCs w:val="32"/>
         </w:rPr>
-      </w:pPr>
+        <w:t>[</w:t>
+      </w:r>
       <w:r>
         <w:rPr>
           <w:b/>
@@ -1430,641 +1281,141 @@
         </w:rPr>
         <w:t>Your solution here</w:t>
       </w:r>
-    </w:p>
-    <w:p/>
-    <w:p>
-      <w:pPr>
-        <w:pStyle w:val="Heading2"/>
-      </w:pPr>
-      <w:r>
-        <w:lastRenderedPageBreak/>
-        <w:t>1.3 The KV cache</w:t>
-      </w:r>
-    </w:p>
-    <w:p>
-      <w:r>
-        <w:t>After moving the weights in the L1 memory, the code will then compute their multiplication with the input embedding, obtaining the K</w:t>
-      </w:r>
-      <w:r>
-        <w:t>,</w:t>
-      </w:r>
-      <w:r>
-        <w:t xml:space="preserve"> V, and Q tensors. </w:t>
-      </w:r>
-      <w:r>
-        <w:br/>
-      </w:r>
-      <w:r>
-        <w:br/>
-        <w:t xml:space="preserve">You may have noticed a so-called “KV cache”. This is an optimization to reduce the number of computations during the autoregressive phase. During this phase, the output of </w:t>
-      </w:r>
-      <w:proofErr w:type="spellStart"/>
-      <w:r>
-        <w:t>Tiny</w:t>
-      </w:r>
-      <w:r>
-        <w:t>Stories</w:t>
-      </w:r>
-      <w:proofErr w:type="spellEnd"/>
-      <w:r>
-        <w:t xml:space="preserve"> </w:t>
-      </w:r>
-      <w:proofErr w:type="spellStart"/>
-      <w:r>
-        <w:t>LLaMA</w:t>
-      </w:r>
-      <w:proofErr w:type="spellEnd"/>
-      <w:r>
-        <w:t xml:space="preserve"> is a function of both the input embedding and the </w:t>
-      </w:r>
-      <w:r>
-        <w:t xml:space="preserve">previous outputs of the </w:t>
-      </w:r>
-      <w:r>
-        <w:t xml:space="preserve">model. </w:t>
-      </w:r>
-      <w:r>
-        <w:t xml:space="preserve">During the </w:t>
-      </w:r>
-      <w:r>
-        <w:t xml:space="preserve">iterative </w:t>
-      </w:r>
-      <w:r>
-        <w:t xml:space="preserve">autoregressive phase, which is the one in which the model </w:t>
-      </w:r>
-      <w:r>
-        <w:t xml:space="preserve">generates </w:t>
-      </w:r>
-      <w:r>
-        <w:t>text</w:t>
-      </w:r>
-      <w:r>
-        <w:t xml:space="preserve"> related to the input promp</w:t>
-      </w:r>
-      <w:r>
-        <w:t>t</w:t>
-      </w:r>
-      <w:r>
-        <w:t xml:space="preserve">, </w:t>
-      </w:r>
-      <w:r>
-        <w:t>the model will start generating a single output token per iteration, based on</w:t>
-      </w:r>
-      <w:r>
-        <w:t xml:space="preserve"> the input and the previously generated outputs. The generation process will start when the input sequence is provided to the model (generating a starting token) </w:t>
-      </w:r>
-      <w:r>
-        <w:t xml:space="preserve">and will progress until the model produces a stop token. </w:t>
-      </w:r>
-    </w:p>
-    <w:p>
-      <w:r>
-        <w:t xml:space="preserve">During every iteration of this phase, without optimizations, the model should recompute the </w:t>
-      </w:r>
-      <w:r>
-        <w:t xml:space="preserve">K and V tensors and the attention matrix </w:t>
-      </w:r>
-      <w:r>
-        <w:t xml:space="preserve">based on all the previous tokens in the sequence (i.e., the input and the previous outputs). However, this increases </w:t>
-      </w:r>
-      <w:r>
-        <w:t xml:space="preserve">the computation costs a lot. </w:t>
-      </w:r>
-      <w:r>
-        <w:t>Therefore, the KV cache is a</w:t>
-      </w:r>
-      <w:r>
-        <w:t xml:space="preserve"> matrix</w:t>
-      </w:r>
-      <w:r>
-        <w:t xml:space="preserve"> that stores </w:t>
-      </w:r>
-      <w:r>
-        <w:t xml:space="preserve">the K and V vectors already computed for every previous position, so at each step only the K and V of the new token </w:t>
-      </w:r>
-      <w:proofErr w:type="gramStart"/>
-      <w:r>
-        <w:t>have to</w:t>
-      </w:r>
-      <w:proofErr w:type="gramEnd"/>
-      <w:r>
-        <w:t xml:space="preserve"> be computed. In our implementation the cache has a fixed size of STEPS positions per layer (see KEY_CACHE and VALUE_CACHE in conf_and_weights_fp16.h): the vectors of position pos are written at row pos, nothing is ever discarded, and generation stops after STEPS tokens at most</w:t>
-      </w:r>
-      <w:r>
-        <w:t xml:space="preserve">. Its </w:t>
-      </w:r>
-      <w:proofErr w:type="spellStart"/>
-      <w:r>
-        <w:t>behaviour</w:t>
-      </w:r>
-      <w:proofErr w:type="spellEnd"/>
-      <w:r>
-        <w:t xml:space="preserve"> is depicted in the image below. </w:t>
-      </w:r>
-      <w:r>
-        <w:br/>
-      </w:r>
-      <w:r>
-        <w:br/>
-      </w:r>
-      <w:r>
-        <w:rPr>
-          <w:noProof/>
-        </w:rPr>
-        <w:drawing>
-          <wp:inline distT="114300" distB="114300" distL="114300" distR="114300" wp14:anchorId="2FCC259B" wp14:editId="2FCC259C">
-            <wp:extent cx="5476875" cy="2038350"/>
-            <wp:effectExtent l="0" t="0" r="0" b="0"/>
-            <wp:docPr id="16" name="image10.png"/>
-            <wp:cNvGraphicFramePr/>
-            <a:graphic xmlns:a="http://schemas.openxmlformats.org/drawingml/2006/main">
-              <a:graphicData uri="http://schemas.openxmlformats.org/drawingml/2006/picture">
-                <pic:pic xmlns:pic="http://schemas.openxmlformats.org/drawingml/2006/picture">
-                  <pic:nvPicPr>
-                    <pic:cNvPr id="0" name="image10.png"/>
-                    <pic:cNvPicPr preferRelativeResize="0"/>
-                  </pic:nvPicPr>
-                  <pic:blipFill>
-                    <a:blip r:embed="rId17"/>
-                    <a:srcRect l="7108" t="49449"/>
-                    <a:stretch>
-                      <a:fillRect/>
-                    </a:stretch>
-                  </pic:blipFill>
-                  <pic:spPr>
-                    <a:xfrm>
-                      <a:off x="0" y="0"/>
-                      <a:ext cx="5476875" cy="2038350"/>
-                    </a:xfrm>
-                    <a:prstGeom prst="rect">
-                      <a:avLst/>
-                    </a:prstGeom>
-                    <a:ln/>
-                  </pic:spPr>
-                </pic:pic>
-              </a:graphicData>
-            </a:graphic>
-          </wp:inline>
-        </w:drawing>
-      </w:r>
-    </w:p>
-    <w:p>
-      <w:pPr>
-        <w:pStyle w:val="Heading2"/>
-      </w:pPr>
-      <w:r>
-        <w:lastRenderedPageBreak/>
-        <w:t>1.4 Multi-Head Self-Attention (MHSA)</w:t>
-      </w:r>
-    </w:p>
-    <w:p>
-      <w:pPr>
-        <w:rPr>
-          <w:b/>
-        </w:rPr>
-      </w:pPr>
-      <w:r>
-        <w:t xml:space="preserve">We now have all the elements to perform the attention, which is composed of a series of matrix vector operations. We will now implement missing code concerning the attention block (the Multi-Head Self-Attention or MHSA). </w:t>
-      </w:r>
-      <w:r>
-        <w:br/>
-      </w:r>
-      <w:r>
-        <w:br/>
-        <w:t xml:space="preserve">Complete the code in the </w:t>
-      </w:r>
-      <w:proofErr w:type="spellStart"/>
-      <w:r>
-        <w:rPr>
-          <w:b/>
-        </w:rPr>
-        <w:t>MHSA.c</w:t>
-      </w:r>
-      <w:proofErr w:type="spellEnd"/>
-      <w:r>
-        <w:rPr>
-          <w:b/>
-        </w:rPr>
-        <w:t xml:space="preserve"> file</w:t>
-      </w:r>
-      <w:r>
-        <w:t>:</w:t>
-      </w:r>
-      <w:r>
-        <w:rPr>
-          <w:b/>
-          <w:noProof/>
-        </w:rPr>
-        <w:drawing>
-          <wp:inline distT="114300" distB="114300" distL="114300" distR="114300" wp14:anchorId="2FCC259D" wp14:editId="517AFC77">
-            <wp:extent cx="6667500" cy="2749789"/>
-            <wp:effectExtent l="0" t="0" r="0" b="0"/>
-            <wp:docPr id="13" name="image14.png"/>
-            <wp:cNvGraphicFramePr/>
-            <a:graphic xmlns:a="http://schemas.openxmlformats.org/drawingml/2006/main">
-              <a:graphicData uri="http://schemas.openxmlformats.org/drawingml/2006/picture">
-                <pic:pic xmlns:pic="http://schemas.openxmlformats.org/drawingml/2006/picture">
-                  <pic:nvPicPr>
-                    <pic:cNvPr id="0" name="image14.png"/>
-                    <pic:cNvPicPr preferRelativeResize="0"/>
-                  </pic:nvPicPr>
-                  <pic:blipFill>
-                    <a:blip r:embed="rId18"/>
-                    <a:srcRect/>
-                    <a:stretch>
-                      <a:fillRect/>
-                    </a:stretch>
-                  </pic:blipFill>
-                  <pic:spPr>
-                    <a:xfrm>
-                      <a:off x="0" y="0"/>
-                      <a:ext cx="6684877" cy="2756956"/>
-                    </a:xfrm>
-                    <a:prstGeom prst="rect">
-                      <a:avLst/>
-                    </a:prstGeom>
-                    <a:ln/>
-                  </pic:spPr>
-                </pic:pic>
-              </a:graphicData>
-            </a:graphic>
-          </wp:inline>
-        </w:drawing>
-      </w:r>
-      <w:r>
-        <w:rPr>
-          <w:b/>
-          <w:noProof/>
-        </w:rPr>
-        <w:drawing>
-          <wp:inline distT="0" distB="0" distL="0" distR="0" wp14:anchorId="04D119D3" wp14:editId="63D62E1B">
-            <wp:extent cx="6038120" cy="2068830"/>
-            <wp:effectExtent l="0" t="0" r="1270" b="7620"/>
-            <wp:docPr id="1113525304" name="Picture 6"/>
-            <wp:cNvGraphicFramePr>
-              <a:graphicFrameLocks xmlns:a="http://schemas.openxmlformats.org/drawingml/2006/main" noChangeAspect="1"/>
-            </wp:cNvGraphicFramePr>
-            <a:graphic xmlns:a="http://schemas.openxmlformats.org/drawingml/2006/main">
-              <a:graphicData uri="http://schemas.openxmlformats.org/drawingml/2006/picture">
-                <pic:pic xmlns:pic="http://schemas.openxmlformats.org/drawingml/2006/picture">
-                  <pic:nvPicPr>
-                    <pic:cNvPr id="1113525304" name=""/>
-                    <pic:cNvPicPr/>
-                  </pic:nvPicPr>
-                  <pic:blipFill>
-                    <a:blip r:embed="rId19">
-                      <a:extLst>
-                        <a:ext uri="{28A0092B-C50C-407E-A947-70E740481C1C}">
-                          <a14:useLocalDpi xmlns:a14="http://schemas.microsoft.com/office/drawing/2010/main" val="0"/>
-                        </a:ext>
-                      </a:extLst>
-                    </a:blip>
-                    <a:stretch>
-                      <a:fillRect/>
-                    </a:stretch>
-                  </pic:blipFill>
-                  <pic:spPr>
-                    <a:xfrm>
-                      <a:off x="0" y="0"/>
-                      <a:ext cx="6038120" cy="2068830"/>
-                    </a:xfrm>
-                    <a:prstGeom prst="rect">
-                      <a:avLst/>
-                    </a:prstGeom>
-                  </pic:spPr>
-                </pic:pic>
-              </a:graphicData>
-            </a:graphic>
-          </wp:inline>
-        </w:drawing>
-      </w:r>
-    </w:p>
-    <w:p>
-      <w:pPr>
-        <w:rPr>
-          <w:b/>
-          <w:sz w:val="32"/>
-          <w:szCs w:val="32"/>
-        </w:rPr>
-      </w:pPr>
-      <w:r>
-        <w:rPr>
-          <w:b/>
-          <w:sz w:val="32"/>
-          <w:szCs w:val="32"/>
-        </w:rPr>
-        <w:t>Put a screenshot or copy your code here:</w:t>
-      </w:r>
-    </w:p>
-    <w:p>
-      <w:pPr>
+      <w:r>
         <w:rPr>
           <w:b/>
           <w:color w:val="FF0000"/>
           <w:sz w:val="32"/>
           <w:szCs w:val="32"/>
         </w:rPr>
-      </w:pPr>
-      <w:r>
+        <w:t>]</w:t>
+      </w:r>
+    </w:p>
+    <w:p>
+      <w:r>
+        <w:br w:type="page"/>
+      </w:r>
+    </w:p>
+    <w:p/>
+    <w:p>
+      <w:pPr>
+        <w:pStyle w:val="Heading2"/>
+      </w:pPr>
+      <w:r>
+        <w:t>Task 1.3 – Multi-Head</w:t>
+      </w:r>
+      <w:r>
+        <w:t xml:space="preserve"> Self-Attention (MHSA)</w:t>
+      </w:r>
+    </w:p>
+    <w:p>
+      <w:r>
+        <w:t xml:space="preserve">We now have all the elements to perform the attention, which is composed of a series of </w:t>
+      </w:r>
+      <w:r>
+        <w:t>matrix-vector operations</w:t>
+      </w:r>
+      <w:r>
+        <w:t xml:space="preserve">. </w:t>
+      </w:r>
+      <w:r>
+        <w:t>I</w:t>
+      </w:r>
+      <w:r>
+        <w:t xml:space="preserve">mplement missing code concerning the attention block. </w:t>
+      </w:r>
+      <w:r>
+        <w:br/>
+      </w:r>
+      <w:r>
+        <w:br/>
+      </w:r>
+      <w:r>
+        <w:rPr>
+          <w:b/>
+          <w:bCs/>
+        </w:rPr>
+        <w:t xml:space="preserve">Hint: Look for “Task 1.3” comments in </w:t>
+      </w:r>
+      <w:proofErr w:type="spellStart"/>
+      <w:r>
+        <w:rPr>
+          <w:b/>
+          <w:bCs/>
+        </w:rPr>
+        <w:t>MHSA.c</w:t>
+      </w:r>
+      <w:proofErr w:type="spellEnd"/>
+      <w:r>
+        <w:rPr>
+          <w:b/>
+          <w:bCs/>
+        </w:rPr>
+        <w:t>.</w:t>
+      </w:r>
+      <w:r>
+        <w:rPr>
+          <w:b/>
+          <w:bCs/>
+        </w:rPr>
+        <w:t xml:space="preserve"> </w:t>
+      </w:r>
+      <w:r>
+        <w:t>Also, you will only be able to run the project after task 2.1.</w:t>
+      </w:r>
+    </w:p>
+    <w:p>
+      <w:pPr>
+        <w:rPr>
+          <w:b/>
+          <w:sz w:val="32"/>
+          <w:szCs w:val="32"/>
+        </w:rPr>
+      </w:pPr>
+      <w:r>
+        <w:rPr>
+          <w:b/>
+          <w:sz w:val="32"/>
+          <w:szCs w:val="32"/>
+        </w:rPr>
+        <w:t>C</w:t>
+      </w:r>
+      <w:r>
+        <w:rPr>
+          <w:b/>
+          <w:sz w:val="32"/>
+          <w:szCs w:val="32"/>
+        </w:rPr>
+        <w:t>opy your code here:</w:t>
+      </w:r>
+    </w:p>
+    <w:p>
+      <w:pPr>
         <w:rPr>
           <w:b/>
           <w:color w:val="FF0000"/>
           <w:sz w:val="32"/>
           <w:szCs w:val="32"/>
         </w:rPr>
-        <w:t>Your solution here</w:t>
-      </w:r>
-    </w:p>
-    <w:p/>
-    <w:p>
-      <w:pPr>
-        <w:pStyle w:val="Heading1"/>
-        <w:rPr>
-          <w:b/>
-        </w:rPr>
-      </w:pPr>
-      <w:bookmarkStart w:id="6" w:name="_736wcx1unmxq" w:colFirst="0" w:colLast="0"/>
-      <w:bookmarkEnd w:id="6"/>
-      <w:r>
-        <w:rPr>
-          <w:b/>
-        </w:rPr>
-        <w:lastRenderedPageBreak/>
-        <w:t>Task 2: Using your transformer</w:t>
-      </w:r>
-    </w:p>
-    <w:p>
-      <w:pPr>
-        <w:pStyle w:val="Heading2"/>
-      </w:pPr>
-      <w:r>
-        <w:t xml:space="preserve">2.1 Completing </w:t>
-      </w:r>
-      <w:proofErr w:type="spellStart"/>
-      <w:r>
-        <w:t>net_</w:t>
-      </w:r>
-      <w:proofErr w:type="gramStart"/>
-      <w:r>
-        <w:t>step</w:t>
-      </w:r>
-      <w:proofErr w:type="spellEnd"/>
-      <w:r>
-        <w:t>(</w:t>
-      </w:r>
-      <w:proofErr w:type="gramEnd"/>
-      <w:r>
-        <w:t>)</w:t>
-      </w:r>
-    </w:p>
-    <w:p>
-      <w:r>
-        <w:t xml:space="preserve">Now, let’s go to </w:t>
-      </w:r>
-      <w:proofErr w:type="spellStart"/>
-      <w:r>
-        <w:t>Tiny</w:t>
-      </w:r>
-      <w:r>
-        <w:t>Stories</w:t>
-      </w:r>
-      <w:proofErr w:type="spellEnd"/>
-      <w:r>
-        <w:t xml:space="preserve"> </w:t>
-      </w:r>
-      <w:proofErr w:type="spellStart"/>
-      <w:r>
-        <w:t>LLaMA</w:t>
-      </w:r>
-      <w:r>
-        <w:t>’s</w:t>
-      </w:r>
-      <w:proofErr w:type="spellEnd"/>
-      <w:r>
-        <w:t xml:space="preserve"> execution. </w:t>
-      </w:r>
-      <w:r>
-        <w:t>In</w:t>
-      </w:r>
-      <w:r>
-        <w:t xml:space="preserve"> every iteration, the transformer will, at first, </w:t>
-      </w:r>
-      <w:proofErr w:type="gramStart"/>
-      <w:r>
-        <w:t>do</w:t>
-      </w:r>
-      <w:proofErr w:type="gramEnd"/>
-      <w:r>
-        <w:t xml:space="preserve"> a forward step to compute the prediction with respect to its input</w:t>
-      </w:r>
-      <w:r>
-        <w:t>s</w:t>
-      </w:r>
-      <w:r>
-        <w:t xml:space="preserve"> and the previous tokens (stored in the KV cache). Then, the model will sample the correct token among the outputs of the current inference. Finally, it will do the decoding. Following the scheme of the transformer architecture, complete the code in the “</w:t>
-      </w:r>
-      <w:proofErr w:type="spellStart"/>
-      <w:r>
-        <w:t>net_</w:t>
-      </w:r>
-      <w:proofErr w:type="gramStart"/>
-      <w:r>
-        <w:t>step</w:t>
-      </w:r>
-      <w:proofErr w:type="spellEnd"/>
-      <w:r>
-        <w:t>(</w:t>
-      </w:r>
-      <w:proofErr w:type="gramEnd"/>
-      <w:r>
-        <w:t>)” function of</w:t>
-      </w:r>
-      <w:r>
-        <w:rPr>
-          <w:b/>
-        </w:rPr>
-        <w:t xml:space="preserve"> </w:t>
-      </w:r>
-      <w:proofErr w:type="spellStart"/>
-      <w:r>
-        <w:rPr>
-          <w:b/>
-        </w:rPr>
-        <w:t>net.c</w:t>
-      </w:r>
-      <w:proofErr w:type="spellEnd"/>
-      <w:r>
-        <w:rPr>
-          <w:b/>
-        </w:rPr>
-        <w:t xml:space="preserve"> file</w:t>
-      </w:r>
-      <w:r>
-        <w:t xml:space="preserve">. Try to read their source code to gain more insights </w:t>
-      </w:r>
-      <w:proofErr w:type="gramStart"/>
-      <w:r>
-        <w:t>of</w:t>
-      </w:r>
-      <w:proofErr w:type="gramEnd"/>
-      <w:r>
-        <w:t xml:space="preserve"> the inner mechanisms on how the model </w:t>
-      </w:r>
-      <w:proofErr w:type="gramStart"/>
-      <w:r>
-        <w:t>actually works</w:t>
-      </w:r>
-      <w:proofErr w:type="gramEnd"/>
-      <w:r>
-        <w:t>.</w:t>
-      </w:r>
-      <w:r>
-        <w:br/>
-      </w:r>
-      <w:r>
-        <w:br/>
-      </w:r>
-      <w:r>
-        <w:t xml:space="preserve">To complete this exercise, simply call the correct function for each location. </w:t>
-      </w:r>
-    </w:p>
-    <w:p>
-      <w:r>
-        <w:t xml:space="preserve">First, </w:t>
-      </w:r>
-      <w:proofErr w:type="gramStart"/>
-      <w:r>
-        <w:t>uncomment</w:t>
-      </w:r>
-      <w:proofErr w:type="gramEnd"/>
-      <w:r>
-        <w:t xml:space="preserve"> this code:</w:t>
-      </w:r>
-    </w:p>
-    <w:p>
-      <w:r>
-        <w:rPr>
-          <w:noProof/>
-        </w:rPr>
-        <w:drawing>
-          <wp:inline distT="114300" distB="114300" distL="114300" distR="114300" wp14:anchorId="2FCC25A1" wp14:editId="2DF94CFE">
-            <wp:extent cx="6334125" cy="4377998"/>
-            <wp:effectExtent l="0" t="0" r="0" b="3810"/>
-            <wp:docPr id="7" name="image6.png"/>
-            <wp:cNvGraphicFramePr/>
-            <a:graphic xmlns:a="http://schemas.openxmlformats.org/drawingml/2006/main">
-              <a:graphicData uri="http://schemas.openxmlformats.org/drawingml/2006/picture">
-                <pic:pic xmlns:pic="http://schemas.openxmlformats.org/drawingml/2006/picture">
-                  <pic:nvPicPr>
-                    <pic:cNvPr id="0" name="image6.png"/>
-                    <pic:cNvPicPr preferRelativeResize="0"/>
-                  </pic:nvPicPr>
-                  <pic:blipFill>
-                    <a:blip r:embed="rId20"/>
-                    <a:srcRect/>
-                    <a:stretch>
-                      <a:fillRect/>
-                    </a:stretch>
-                  </pic:blipFill>
-                  <pic:spPr>
-                    <a:xfrm>
-                      <a:off x="0" y="0"/>
-                      <a:ext cx="6344334" cy="4385054"/>
-                    </a:xfrm>
-                    <a:prstGeom prst="rect">
-                      <a:avLst/>
-                    </a:prstGeom>
-                    <a:ln/>
-                  </pic:spPr>
-                </pic:pic>
-              </a:graphicData>
-            </a:graphic>
-          </wp:inline>
-        </w:drawing>
-      </w:r>
-    </w:p>
-    <w:p>
-      <w:r>
-        <w:lastRenderedPageBreak/>
-        <w:t>Then, complete it with the missing functions:</w:t>
-      </w:r>
-    </w:p>
-    <w:p>
-      <w:r>
-        <w:rPr>
-          <w:noProof/>
-        </w:rPr>
-        <w:drawing>
-          <wp:inline distT="114300" distB="114300" distL="114300" distR="114300" wp14:anchorId="2FCC25A3" wp14:editId="43179924">
-            <wp:extent cx="6353175" cy="4406234"/>
-            <wp:effectExtent l="0" t="0" r="0" b="0"/>
-            <wp:docPr id="18" name="image9.png"/>
-            <wp:cNvGraphicFramePr/>
-            <a:graphic xmlns:a="http://schemas.openxmlformats.org/drawingml/2006/main">
-              <a:graphicData uri="http://schemas.openxmlformats.org/drawingml/2006/picture">
-                <pic:pic xmlns:pic="http://schemas.openxmlformats.org/drawingml/2006/picture">
-                  <pic:nvPicPr>
-                    <pic:cNvPr id="0" name="image9.png"/>
-                    <pic:cNvPicPr preferRelativeResize="0"/>
-                  </pic:nvPicPr>
-                  <pic:blipFill>
-                    <a:blip r:embed="rId21"/>
-                    <a:srcRect/>
-                    <a:stretch>
-                      <a:fillRect/>
-                    </a:stretch>
-                  </pic:blipFill>
-                  <pic:spPr>
-                    <a:xfrm>
-                      <a:off x="0" y="0"/>
-                      <a:ext cx="6362346" cy="4412595"/>
-                    </a:xfrm>
-                    <a:prstGeom prst="rect">
-                      <a:avLst/>
-                    </a:prstGeom>
-                    <a:ln/>
-                  </pic:spPr>
-                </pic:pic>
-              </a:graphicData>
-            </a:graphic>
-          </wp:inline>
-        </w:drawing>
-      </w:r>
-      <w:r>
-        <w:br/>
-      </w:r>
-      <w:r>
-        <w:br/>
-        <w:t xml:space="preserve">All the functions are already declared and defined in the various .c files included in this laboratory. </w:t>
-      </w:r>
-    </w:p>
-    <w:p>
-      <w:pPr>
+      </w:pPr>
+      <w:r>
         <w:rPr>
           <w:b/>
           <w:color w:val="FF0000"/>
           <w:sz w:val="32"/>
           <w:szCs w:val="32"/>
         </w:rPr>
-      </w:pPr>
-      <w:r>
-        <w:rPr>
-          <w:b/>
-          <w:sz w:val="32"/>
-          <w:szCs w:val="32"/>
-        </w:rPr>
-        <w:t>Put a screenshot or copy your code here:</w:t>
-      </w:r>
-    </w:p>
-    <w:p>
-      <w:pPr>
+        <w:t>[</w:t>
+      </w:r>
+      <w:r>
         <w:rPr>
           <w:b/>
           <w:color w:val="FF0000"/>
           <w:sz w:val="32"/>
           <w:szCs w:val="32"/>
         </w:rPr>
-      </w:pPr>
+        <w:t>Your solution here</w:t>
+      </w:r>
       <w:r>
         <w:rPr>
           <w:b/>
@@ -2072,8 +1423,246 @@
           <w:sz w:val="32"/>
           <w:szCs w:val="32"/>
         </w:rPr>
+        <w:t>]</w:t>
+      </w:r>
+    </w:p>
+    <w:p>
+      <w:r>
+        <w:br w:type="page"/>
+      </w:r>
+    </w:p>
+    <w:p>
+      <w:pPr>
+        <w:pStyle w:val="Heading1"/>
+        <w:rPr>
+          <w:b/>
+        </w:rPr>
+      </w:pPr>
+      <w:bookmarkStart w:id="6" w:name="_736wcx1unmxq" w:colFirst="0" w:colLast="0"/>
+      <w:bookmarkEnd w:id="6"/>
+      <w:r>
+        <w:rPr>
+          <w:b/>
+        </w:rPr>
+        <w:lastRenderedPageBreak/>
+        <w:t>Task 2 – Using</w:t>
+      </w:r>
+      <w:r>
+        <w:rPr>
+          <w:b/>
+        </w:rPr>
+        <w:t xml:space="preserve"> your transformer</w:t>
+      </w:r>
+    </w:p>
+    <w:p>
+      <w:pPr>
+        <w:pStyle w:val="Heading2"/>
+      </w:pPr>
+      <w:r>
+        <w:t>Task 2.1 – Completing</w:t>
+      </w:r>
+      <w:r>
+        <w:t xml:space="preserve"> </w:t>
+      </w:r>
+      <w:proofErr w:type="spellStart"/>
+      <w:r>
+        <w:t>net_</w:t>
+      </w:r>
+      <w:proofErr w:type="gramStart"/>
+      <w:r>
+        <w:t>step</w:t>
+      </w:r>
+      <w:proofErr w:type="spellEnd"/>
+      <w:r>
+        <w:t>(</w:t>
+      </w:r>
+      <w:proofErr w:type="gramEnd"/>
+      <w:r>
+        <w:t>)</w:t>
+      </w:r>
+    </w:p>
+    <w:p>
+      <w:r>
+        <w:t>Following the scheme of the transformer architecture, complete the code in the “</w:t>
+      </w:r>
+      <w:proofErr w:type="spellStart"/>
+      <w:r>
+        <w:rPr>
+          <w:i/>
+          <w:iCs/>
+        </w:rPr>
+        <w:t>net_</w:t>
+      </w:r>
+      <w:proofErr w:type="gramStart"/>
+      <w:r>
+        <w:rPr>
+          <w:i/>
+          <w:iCs/>
+        </w:rPr>
+        <w:t>step</w:t>
+      </w:r>
+      <w:proofErr w:type="spellEnd"/>
+      <w:r>
+        <w:rPr>
+          <w:i/>
+          <w:iCs/>
+        </w:rPr>
+        <w:t>(</w:t>
+      </w:r>
+      <w:proofErr w:type="gramEnd"/>
+      <w:r>
+        <w:rPr>
+          <w:i/>
+          <w:iCs/>
+        </w:rPr>
+        <w:t>)</w:t>
+      </w:r>
+      <w:r>
+        <w:t>” function of</w:t>
+      </w:r>
+      <w:r>
+        <w:rPr>
+          <w:b/>
+        </w:rPr>
+        <w:t xml:space="preserve"> </w:t>
+      </w:r>
+      <w:proofErr w:type="spellStart"/>
+      <w:r>
+        <w:rPr>
+          <w:b/>
+          <w:i/>
+          <w:iCs/>
+        </w:rPr>
+        <w:t>net.c</w:t>
+      </w:r>
+      <w:proofErr w:type="spellEnd"/>
+      <w:r>
+        <w:rPr>
+          <w:b/>
+        </w:rPr>
+        <w:t xml:space="preserve"> </w:t>
+      </w:r>
+      <w:r>
+        <w:rPr>
+          <w:bCs/>
+        </w:rPr>
+        <w:t>file</w:t>
+      </w:r>
+      <w:r>
+        <w:t xml:space="preserve">. </w:t>
+      </w:r>
+      <w:r>
+        <w:t>Look for the “Task 2.1” comment</w:t>
+      </w:r>
+      <w:r>
+        <w:rPr>
+          <w:b/>
+          <w:bCs/>
+        </w:rPr>
+        <w:t xml:space="preserve"> </w:t>
+      </w:r>
+      <w:r>
+        <w:t xml:space="preserve">for the exact location. Replace </w:t>
+      </w:r>
+      <w:r>
+        <w:rPr>
+          <w:b/>
+          <w:bCs/>
+          <w:i/>
+          <w:iCs/>
+        </w:rPr>
+        <w:t>MISSING_FUNCTION</w:t>
+      </w:r>
+      <w:r>
+        <w:rPr>
+          <w:b/>
+          <w:bCs/>
+          <w:i/>
+          <w:iCs/>
+        </w:rPr>
+        <w:t xml:space="preserve"> </w:t>
+      </w:r>
+      <w:r>
+        <w:t>with actual calls.</w:t>
+      </w:r>
+      <w:r>
+        <w:br/>
+      </w:r>
+      <w:r>
+        <w:br/>
+        <w:t xml:space="preserve">All the </w:t>
+      </w:r>
+      <w:proofErr w:type="gramStart"/>
+      <w:r>
+        <w:t xml:space="preserve">needed </w:t>
+      </w:r>
+      <w:r>
+        <w:t>functions</w:t>
+      </w:r>
+      <w:proofErr w:type="gramEnd"/>
+      <w:r>
+        <w:t xml:space="preserve"> are already declared and defined in the various .c files included in this laboratory. </w:t>
+      </w:r>
+    </w:p>
+    <w:p>
+      <w:pPr>
+        <w:rPr>
+          <w:b/>
+          <w:color w:val="FF0000"/>
+          <w:sz w:val="32"/>
+          <w:szCs w:val="32"/>
+        </w:rPr>
+      </w:pPr>
+      <w:r>
+        <w:rPr>
+          <w:b/>
+          <w:sz w:val="32"/>
+          <w:szCs w:val="32"/>
+        </w:rPr>
+        <w:t>Put a screenshot or copy your code here:</w:t>
+      </w:r>
+    </w:p>
+    <w:p>
+      <w:pPr>
+        <w:rPr>
+          <w:b/>
+          <w:color w:val="FF0000"/>
+          <w:sz w:val="32"/>
+          <w:szCs w:val="32"/>
+        </w:rPr>
+      </w:pPr>
+      <w:r>
+        <w:rPr>
+          <w:b/>
+          <w:color w:val="FF0000"/>
+          <w:sz w:val="32"/>
+          <w:szCs w:val="32"/>
+        </w:rPr>
+        <w:t>[</w:t>
+      </w:r>
+      <w:r>
+        <w:rPr>
+          <w:b/>
+          <w:color w:val="FF0000"/>
+          <w:sz w:val="32"/>
+          <w:szCs w:val="32"/>
+        </w:rPr>
         <w:t>Your solution here</w:t>
       </w:r>
+      <w:r>
+        <w:rPr>
+          <w:b/>
+          <w:color w:val="FF0000"/>
+          <w:sz w:val="32"/>
+          <w:szCs w:val="32"/>
+        </w:rPr>
+        <w:t>]</w:t>
+      </w:r>
+    </w:p>
+    <w:p>
+      <w:r>
+        <w:br w:type="page"/>
+      </w:r>
     </w:p>
     <w:p/>
     <w:p>
@@ -2081,23 +1670,53 @@
         <w:pStyle w:val="Heading2"/>
       </w:pPr>
       <w:r>
-        <w:t>2.2 Profiling the attention</w:t>
-      </w:r>
-    </w:p>
-    <w:p>
-      <w:r>
-        <w:t>After completing the task, activate profiling for layer l ==</w:t>
-      </w:r>
-      <w:r>
+        <w:t>Task 2.2 – Profiling</w:t>
+      </w:r>
+      <w:r>
+        <w:t xml:space="preserve"> the attention</w:t>
+      </w:r>
+    </w:p>
+    <w:p>
+      <w:r>
+        <w:t xml:space="preserve">After completing the task, activate profiling for layer </w:t>
+      </w:r>
+      <w:r>
+        <w:rPr>
+          <w:i/>
+          <w:iCs/>
+        </w:rPr>
+        <w:t>l</w:t>
+      </w:r>
+      <w:r>
+        <w:rPr>
+          <w:i/>
+          <w:iCs/>
+        </w:rPr>
+        <w:t xml:space="preserve"> ==</w:t>
+      </w:r>
+      <w:r>
+        <w:rPr>
+          <w:i/>
+          <w:iCs/>
+        </w:rPr>
         <w:t xml:space="preserve"> </w:t>
       </w:r>
       <w:r>
-        <w:t xml:space="preserve">0 using the </w:t>
+        <w:rPr>
+          <w:i/>
+          <w:iCs/>
+        </w:rPr>
+        <w:t>0</w:t>
+      </w:r>
+      <w:r>
+        <w:t xml:space="preserve"> using the </w:t>
       </w:r>
       <w:r>
         <w:rPr>
           <w:rFonts w:ascii="Courier New" w:eastAsia="Courier New" w:hAnsi="Courier New" w:cs="Courier New"/>
           <w:b/>
+          <w:i/>
+          <w:iCs/>
           <w:sz w:val="21"/>
           <w:szCs w:val="21"/>
         </w:rPr>
@@ -2108,6 +1727,8 @@
         <w:rPr>
           <w:rFonts w:ascii="Courier New" w:eastAsia="Courier New" w:hAnsi="Courier New" w:cs="Courier New"/>
           <w:b/>
+          <w:i/>
+          <w:iCs/>
           <w:sz w:val="21"/>
           <w:szCs w:val="21"/>
         </w:rPr>
@@ -2118,10 +1739,12 @@
         <w:rPr>
           <w:rFonts w:ascii="Courier New" w:eastAsia="Courier New" w:hAnsi="Courier New" w:cs="Courier New"/>
           <w:b/>
+          <w:i/>
+          <w:iCs/>
           <w:sz w:val="21"/>
           <w:szCs w:val="21"/>
         </w:rPr>
-        <w:t>),</w:t>
+        <w:t>)</w:t>
       </w:r>
       <w:r>
         <w:rPr>
@@ -2130,7 +1753,7 @@
           <w:sz w:val="21"/>
           <w:szCs w:val="21"/>
         </w:rPr>
-        <w:t xml:space="preserve"> </w:t>
+        <w:t>,</w:t>
       </w:r>
       <w:r>
         <w:rPr>
@@ -2139,26 +1762,41 @@
           <w:sz w:val="21"/>
           <w:szCs w:val="21"/>
         </w:rPr>
-        <w:t>START_</w:t>
-      </w:r>
-      <w:proofErr w:type="gramStart"/>
+        <w:t xml:space="preserve"> </w:t>
+      </w:r>
       <w:r>
         <w:rPr>
           <w:rFonts w:ascii="Courier New" w:eastAsia="Courier New" w:hAnsi="Courier New" w:cs="Courier New"/>
           <w:b/>
+          <w:i/>
+          <w:iCs/>
           <w:sz w:val="21"/>
           <w:szCs w:val="21"/>
         </w:rPr>
-        <w:t>STATS(</w:t>
-      </w:r>
-      <w:proofErr w:type="gramEnd"/>
+        <w:t>START_</w:t>
+      </w:r>
+      <w:proofErr w:type="gramStart"/>
       <w:r>
         <w:rPr>
           <w:rFonts w:ascii="Courier New" w:eastAsia="Courier New" w:hAnsi="Courier New" w:cs="Courier New"/>
           <w:b/>
+          <w:i/>
+          <w:iCs/>
           <w:sz w:val="21"/>
           <w:szCs w:val="21"/>
         </w:rPr>
+        <w:t>STATS(</w:t>
+      </w:r>
+      <w:proofErr w:type="gramEnd"/>
+      <w:r>
+        <w:rPr>
+          <w:rFonts w:ascii="Courier New" w:eastAsia="Courier New" w:hAnsi="Courier New" w:cs="Courier New"/>
+          <w:b/>
+          <w:i/>
+          <w:iCs/>
+          <w:sz w:val="21"/>
+          <w:szCs w:val="21"/>
+        </w:rPr>
         <w:t>)</w:t>
       </w:r>
       <w:r>
@@ -2172,6 +1810,8 @@
         <w:rPr>
           <w:rFonts w:ascii="Courier New" w:eastAsia="Courier New" w:hAnsi="Courier New" w:cs="Courier New"/>
           <w:b/>
+          <w:i/>
+          <w:iCs/>
           <w:sz w:val="21"/>
           <w:szCs w:val="21"/>
         </w:rPr>
@@ -2182,6 +1822,8 @@
         <w:rPr>
           <w:rFonts w:ascii="Courier New" w:eastAsia="Courier New" w:hAnsi="Courier New" w:cs="Courier New"/>
           <w:b/>
+          <w:i/>
+          <w:iCs/>
           <w:sz w:val="21"/>
           <w:szCs w:val="21"/>
         </w:rPr>
@@ -2192,6 +1834,8 @@
         <w:rPr>
           <w:rFonts w:ascii="Courier New" w:eastAsia="Courier New" w:hAnsi="Courier New" w:cs="Courier New"/>
           <w:b/>
+          <w:i/>
+          <w:iCs/>
           <w:sz w:val="21"/>
           <w:szCs w:val="21"/>
         </w:rPr>
@@ -2202,20 +1846,34 @@
       </w:r>
       <w:proofErr w:type="spellStart"/>
       <w:r>
+        <w:rPr>
+          <w:b/>
+          <w:bCs/>
+          <w:i/>
+          <w:iCs/>
+        </w:rPr>
         <w:t>stats.h</w:t>
       </w:r>
       <w:proofErr w:type="spellEnd"/>
       <w:r>
-        <w:t xml:space="preserve"> header. </w:t>
-      </w:r>
-    </w:p>
-    <w:p>
-      <w:r>
-        <w:lastRenderedPageBreak/>
+        <w:t xml:space="preserve"> header.</w:t>
+      </w:r>
+      <w:r>
+        <w:t xml:space="preserve"> Only core 0 will be profiled.</w:t>
+      </w:r>
+    </w:p>
+    <w:p>
+      <w:r>
         <w:t xml:space="preserve">You must also enable them by uncommenting the following line in the main folder’s </w:t>
       </w:r>
       <w:proofErr w:type="spellStart"/>
       <w:r>
+        <w:rPr>
+          <w:b/>
+          <w:bCs/>
+          <w:i/>
+          <w:iCs/>
+        </w:rPr>
         <w:t>Makefile</w:t>
       </w:r>
       <w:proofErr w:type="spellEnd"/>
@@ -2285,7 +1943,56 @@
           <w:sz w:val="32"/>
           <w:szCs w:val="32"/>
         </w:rPr>
-        <w:t>Answer the following questions:</w:t>
+        <w:t>Answer the following questions</w:t>
+      </w:r>
+      <w:r>
+        <w:rPr>
+          <w:b/>
+          <w:i/>
+          <w:sz w:val="32"/>
+          <w:szCs w:val="32"/>
+        </w:rPr>
+        <w:t xml:space="preserve"> and try to </w:t>
+      </w:r>
+      <w:proofErr w:type="gramStart"/>
+      <w:r>
+        <w:rPr>
+          <w:b/>
+          <w:i/>
+          <w:sz w:val="32"/>
+          <w:szCs w:val="32"/>
+        </w:rPr>
+        <w:t>give an explanation of</w:t>
+      </w:r>
+      <w:proofErr w:type="gramEnd"/>
+      <w:r>
+        <w:rPr>
+          <w:b/>
+          <w:i/>
+          <w:sz w:val="32"/>
+          <w:szCs w:val="32"/>
+        </w:rPr>
+        <w:t xml:space="preserve"> the </w:t>
+      </w:r>
+      <w:proofErr w:type="gramStart"/>
+      <w:r>
+        <w:rPr>
+          <w:b/>
+          <w:i/>
+          <w:sz w:val="32"/>
+          <w:szCs w:val="32"/>
+        </w:rPr>
+        <w:t>obtained results</w:t>
+      </w:r>
+      <w:proofErr w:type="gramEnd"/>
+      <w:r>
+        <w:rPr>
+          <w:b/>
+          <w:i/>
+          <w:sz w:val="32"/>
+          <w:szCs w:val="32"/>
+        </w:rPr>
+        <w:t>:</w:t>
       </w:r>
     </w:p>
     <w:p>
@@ -2299,14 +2006,29 @@
           <w:sz w:val="28"/>
           <w:szCs w:val="28"/>
         </w:rPr>
-        <w:t>What is the number of cycles to compute the K, Q, and V tensors? You can see there are many of them (autoregressive mode), please report one of the values.</w:t>
-      </w:r>
-      <w:r>
+        <w:t xml:space="preserve">What is the number of cycles to compute </w:t>
+      </w:r>
+      <w:r>
+        <w:rPr>
+          <w:sz w:val="28"/>
+          <w:szCs w:val="28"/>
+        </w:rPr>
+        <w:t>the Q, K and V tensors</w:t>
+      </w:r>
+      <w:r>
+        <w:rPr>
+          <w:sz w:val="28"/>
+          <w:szCs w:val="28"/>
+        </w:rPr>
+        <w:t>? You can see there are many of them (autoregressive mode), please report one of the values.</w:t>
+      </w:r>
+    </w:p>
+    <w:p>
+      <w:pPr>
         <w:rPr>
           <w:color w:val="FF0000"/>
         </w:rPr>
-        <w:t xml:space="preserve"> </w:t>
-      </w:r>
+      </w:pPr>
       <w:r>
         <w:rPr>
           <w:b/>
@@ -2314,44 +2036,7 @@
           <w:sz w:val="32"/>
           <w:szCs w:val="32"/>
         </w:rPr>
-        <w:t>Your solution here</w:t>
-      </w:r>
-    </w:p>
-    <w:p>
-      <w:pPr>
-        <w:rPr>
-          <w:color w:val="FF0000"/>
-        </w:rPr>
-      </w:pPr>
-      <w:r>
-        <w:rPr>
-          <w:sz w:val="36"/>
-          <w:szCs w:val="36"/>
-        </w:rPr>
-        <w:br/>
-      </w:r>
-      <w:r>
-        <w:rPr>
-          <w:sz w:val="28"/>
-          <w:szCs w:val="28"/>
-        </w:rPr>
-        <w:t xml:space="preserve">What is the number of cycles necessary for the calculation of </w:t>
-      </w:r>
-      <w:proofErr w:type="gramStart"/>
-      <w:r>
-        <w:rPr>
-          <w:sz w:val="28"/>
-          <w:szCs w:val="28"/>
-        </w:rPr>
-        <w:t>the attention</w:t>
-      </w:r>
-      <w:proofErr w:type="gramEnd"/>
-      <w:r>
-        <w:rPr>
-          <w:sz w:val="28"/>
-          <w:szCs w:val="28"/>
-        </w:rPr>
-        <w:t xml:space="preserve">? If you look at the numbers of every iteration, do you notice a change in their value? </w:t>
+        <w:t>[Y</w:t>
       </w:r>
       <w:r>
         <w:rPr>
@@ -2360,162 +2045,8 @@
           <w:sz w:val="32"/>
           <w:szCs w:val="32"/>
         </w:rPr>
-        <w:t>Your solution here</w:t>
-      </w:r>
-    </w:p>
-    <w:p>
-      <w:pPr>
-        <w:rPr>
-          <w:b/>
-          <w:i/>
-          <w:sz w:val="36"/>
-          <w:szCs w:val="36"/>
-        </w:rPr>
-      </w:pPr>
-    </w:p>
-    <w:p>
-      <w:pPr>
-        <w:rPr>
-          <w:b/>
-          <w:i/>
-          <w:sz w:val="32"/>
-          <w:szCs w:val="32"/>
-        </w:rPr>
-      </w:pPr>
-      <w:r>
-        <w:rPr>
-          <w:b/>
-          <w:i/>
-          <w:sz w:val="32"/>
-          <w:szCs w:val="32"/>
-        </w:rPr>
-        <w:t xml:space="preserve">Answers must be commented on. </w:t>
-      </w:r>
-      <w:r>
-        <w:rPr>
-          <w:b/>
-          <w:i/>
-          <w:sz w:val="32"/>
-          <w:szCs w:val="32"/>
-        </w:rPr>
-        <w:br/>
-        <w:t xml:space="preserve">Try to </w:t>
-      </w:r>
-      <w:proofErr w:type="gramStart"/>
-      <w:r>
-        <w:rPr>
-          <w:b/>
-          <w:i/>
-          <w:sz w:val="32"/>
-          <w:szCs w:val="32"/>
-        </w:rPr>
-        <w:t>give an explanation of</w:t>
-      </w:r>
-      <w:proofErr w:type="gramEnd"/>
-      <w:r>
-        <w:rPr>
-          <w:b/>
-          <w:i/>
-          <w:sz w:val="32"/>
-          <w:szCs w:val="32"/>
-        </w:rPr>
-        <w:t xml:space="preserve"> the </w:t>
-      </w:r>
-      <w:proofErr w:type="gramStart"/>
-      <w:r>
-        <w:rPr>
-          <w:b/>
-          <w:i/>
-          <w:sz w:val="32"/>
-          <w:szCs w:val="32"/>
-        </w:rPr>
-        <w:t>obtained results</w:t>
-      </w:r>
-      <w:proofErr w:type="gramEnd"/>
-      <w:r>
-        <w:rPr>
-          <w:b/>
-          <w:i/>
-          <w:sz w:val="32"/>
-          <w:szCs w:val="32"/>
-        </w:rPr>
-        <w:t>.</w:t>
-      </w:r>
-    </w:p>
-    <w:p/>
-    <w:p>
-      <w:pPr>
-        <w:pStyle w:val="Heading1"/>
-        <w:rPr>
-          <w:b/>
-        </w:rPr>
-      </w:pPr>
-      <w:bookmarkStart w:id="7" w:name="_tdbfiaawgoli" w:colFirst="0" w:colLast="0"/>
-      <w:bookmarkEnd w:id="7"/>
-      <w:r>
-        <w:rPr>
-          <w:b/>
-        </w:rPr>
-        <w:t>Task 3: Run the model</w:t>
-      </w:r>
-    </w:p>
-    <w:p>
-      <w:pPr>
-        <w:rPr>
-          <w:b/>
-          <w:i/>
-          <w:sz w:val="52"/>
-          <w:szCs w:val="52"/>
-        </w:rPr>
-      </w:pPr>
-      <w:r>
-        <w:t xml:space="preserve">With the previous steps, we then completed the code of our </w:t>
-      </w:r>
-      <w:proofErr w:type="spellStart"/>
-      <w:r>
-        <w:t>Tiny</w:t>
-      </w:r>
-      <w:r>
-        <w:t>Stories</w:t>
-      </w:r>
-      <w:proofErr w:type="spellEnd"/>
-      <w:r>
-        <w:t xml:space="preserve"> </w:t>
-      </w:r>
-      <w:proofErr w:type="spellStart"/>
-      <w:r>
-        <w:t>LLaMA</w:t>
-      </w:r>
-      <w:proofErr w:type="spellEnd"/>
-      <w:r>
-        <w:t xml:space="preserve">. In this step, we will generate a story with our transformer! To do so, run “make clean all run”. </w:t>
-      </w:r>
-    </w:p>
-    <w:p>
-      <w:pPr>
-        <w:rPr>
-          <w:b/>
-          <w:i/>
-          <w:sz w:val="32"/>
-          <w:szCs w:val="32"/>
-        </w:rPr>
-      </w:pPr>
-      <w:r>
-        <w:rPr>
-          <w:b/>
-          <w:i/>
-          <w:sz w:val="32"/>
-          <w:szCs w:val="32"/>
-        </w:rPr>
-        <w:t>Run the full model and copy the story that has been generated:</w:t>
-      </w:r>
-    </w:p>
-    <w:p>
-      <w:pPr>
-        <w:rPr>
-          <w:color w:val="FF0000"/>
-        </w:rPr>
-      </w:pPr>
+        <w:t xml:space="preserve">our </w:t>
+      </w:r>
       <w:r>
         <w:rPr>
           <w:b/>
@@ -2523,19 +2054,312 @@
           <w:sz w:val="32"/>
           <w:szCs w:val="32"/>
         </w:rPr>
-        <w:t>Your solution here</w:t>
-      </w:r>
-    </w:p>
-    <w:p/>
-    <w:p/>
-    <w:p/>
+        <w:t>answer</w:t>
+      </w:r>
+      <w:r>
+        <w:rPr>
+          <w:b/>
+          <w:color w:val="FF0000"/>
+          <w:sz w:val="32"/>
+          <w:szCs w:val="32"/>
+        </w:rPr>
+        <w:t xml:space="preserve"> here</w:t>
+      </w:r>
+      <w:r>
+        <w:rPr>
+          <w:b/>
+          <w:color w:val="FF0000"/>
+          <w:sz w:val="32"/>
+          <w:szCs w:val="32"/>
+        </w:rPr>
+        <w:t>]</w:t>
+      </w:r>
+    </w:p>
+    <w:p>
+      <w:pPr>
+        <w:rPr>
+          <w:sz w:val="28"/>
+          <w:szCs w:val="28"/>
+        </w:rPr>
+      </w:pPr>
+      <w:r>
+        <w:rPr>
+          <w:sz w:val="36"/>
+          <w:szCs w:val="36"/>
+        </w:rPr>
+        <w:br/>
+      </w:r>
+      <w:r>
+        <w:rPr>
+          <w:sz w:val="28"/>
+          <w:szCs w:val="28"/>
+        </w:rPr>
+        <w:t xml:space="preserve">What is the number of cycles necessary for </w:t>
+      </w:r>
+      <w:r>
+        <w:rPr>
+          <w:sz w:val="28"/>
+          <w:szCs w:val="28"/>
+        </w:rPr>
+        <w:t>calculating</w:t>
+      </w:r>
+      <w:r>
+        <w:rPr>
+          <w:sz w:val="28"/>
+          <w:szCs w:val="28"/>
+        </w:rPr>
+        <w:t xml:space="preserve"> </w:t>
+      </w:r>
+      <w:proofErr w:type="gramStart"/>
+      <w:r>
+        <w:rPr>
+          <w:sz w:val="28"/>
+          <w:szCs w:val="28"/>
+        </w:rPr>
+        <w:t>the attention</w:t>
+      </w:r>
+      <w:proofErr w:type="gramEnd"/>
+      <w:r>
+        <w:rPr>
+          <w:sz w:val="28"/>
+          <w:szCs w:val="28"/>
+        </w:rPr>
+        <w:t>? If you look at the numbers of every iteration, do you notice a change in their value?</w:t>
+      </w:r>
+    </w:p>
+    <w:p>
+      <w:pPr>
+        <w:rPr>
+          <w:color w:val="FF0000"/>
+        </w:rPr>
+      </w:pPr>
+      <w:r>
+        <w:rPr>
+          <w:b/>
+          <w:color w:val="FF0000"/>
+          <w:sz w:val="32"/>
+          <w:szCs w:val="32"/>
+        </w:rPr>
+        <w:t>[Y</w:t>
+      </w:r>
+      <w:r>
+        <w:rPr>
+          <w:b/>
+          <w:color w:val="FF0000"/>
+          <w:sz w:val="32"/>
+          <w:szCs w:val="32"/>
+        </w:rPr>
+        <w:t xml:space="preserve">our </w:t>
+      </w:r>
+      <w:r>
+        <w:rPr>
+          <w:b/>
+          <w:color w:val="FF0000"/>
+          <w:sz w:val="32"/>
+          <w:szCs w:val="32"/>
+        </w:rPr>
+        <w:t>answer</w:t>
+      </w:r>
+      <w:r>
+        <w:rPr>
+          <w:b/>
+          <w:color w:val="FF0000"/>
+          <w:sz w:val="32"/>
+          <w:szCs w:val="32"/>
+        </w:rPr>
+        <w:t xml:space="preserve"> here</w:t>
+      </w:r>
+      <w:r>
+        <w:rPr>
+          <w:b/>
+          <w:color w:val="FF0000"/>
+          <w:sz w:val="32"/>
+          <w:szCs w:val="32"/>
+        </w:rPr>
+        <w:t>]</w:t>
+      </w:r>
+    </w:p>
+    <w:p>
+      <w:pPr>
+        <w:rPr>
+          <w:b/>
+          <w:color w:val="039BE5"/>
+          <w:sz w:val="36"/>
+          <w:szCs w:val="36"/>
+        </w:rPr>
+      </w:pPr>
+      <w:bookmarkStart w:id="7" w:name="_tdbfiaawgoli" w:colFirst="0" w:colLast="0"/>
+      <w:bookmarkEnd w:id="7"/>
+      <w:r>
+        <w:rPr>
+          <w:b/>
+        </w:rPr>
+        <w:br w:type="page"/>
+      </w:r>
+    </w:p>
+    <w:p>
+      <w:pPr>
+        <w:pStyle w:val="Heading1"/>
+        <w:rPr>
+          <w:b/>
+        </w:rPr>
+      </w:pPr>
+      <w:r>
+        <w:rPr>
+          <w:b/>
+        </w:rPr>
+        <w:lastRenderedPageBreak/>
+        <w:t>Task 3 – Run</w:t>
+      </w:r>
+      <w:r>
+        <w:rPr>
+          <w:b/>
+        </w:rPr>
+        <w:t xml:space="preserve"> the model</w:t>
+      </w:r>
+    </w:p>
+    <w:p>
+      <w:r>
+        <w:t xml:space="preserve">With the previous steps, </w:t>
+      </w:r>
+      <w:r>
+        <w:t>we have now completed</w:t>
+      </w:r>
+      <w:r>
+        <w:t xml:space="preserve"> the code of our </w:t>
+      </w:r>
+      <w:proofErr w:type="spellStart"/>
+      <w:r>
+        <w:t>Tiny</w:t>
+      </w:r>
+      <w:r>
+        <w:t>Stories</w:t>
+      </w:r>
+      <w:proofErr w:type="spellEnd"/>
+      <w:r>
+        <w:t xml:space="preserve"> </w:t>
+      </w:r>
+      <w:proofErr w:type="spellStart"/>
+      <w:r>
+        <w:t>LLaMA</w:t>
+      </w:r>
+      <w:proofErr w:type="spellEnd"/>
+      <w:r>
+        <w:t xml:space="preserve">. In this step, we will generate a story with our transformer! To do so, </w:t>
+      </w:r>
+      <w:r>
+        <w:rPr>
+          <w:b/>
+          <w:bCs/>
+        </w:rPr>
+        <w:t>REMEMBER TO COMMENT BACK THE STATS FLAG</w:t>
+      </w:r>
+      <w:r>
+        <w:rPr>
+          <w:b/>
+          <w:bCs/>
+        </w:rPr>
+        <w:t xml:space="preserve"> </w:t>
+      </w:r>
+      <w:r>
+        <w:t>and</w:t>
+      </w:r>
+      <w:r>
+        <w:rPr>
+          <w:b/>
+          <w:bCs/>
+        </w:rPr>
+        <w:t xml:space="preserve"> </w:t>
+      </w:r>
+      <w:proofErr w:type="gramStart"/>
+      <w:r>
+        <w:t xml:space="preserve">run </w:t>
+      </w:r>
+      <w:r>
+        <w:rPr>
+          <w:b/>
+          <w:bCs/>
+          <w:i/>
+          <w:iCs/>
+        </w:rPr>
+        <w:t>make</w:t>
+      </w:r>
+      <w:proofErr w:type="gramEnd"/>
+      <w:r>
+        <w:rPr>
+          <w:b/>
+          <w:bCs/>
+          <w:i/>
+          <w:iCs/>
+        </w:rPr>
+        <w:t xml:space="preserve"> clean all run</w:t>
+      </w:r>
+      <w:r>
+        <w:t xml:space="preserve">. </w:t>
+      </w:r>
+    </w:p>
+    <w:p>
+      <w:pPr>
+        <w:rPr>
+          <w:b/>
+          <w:i/>
+          <w:sz w:val="52"/>
+          <w:szCs w:val="52"/>
+        </w:rPr>
+      </w:pPr>
+      <w:r>
+        <w:rPr>
+          <w:b/>
+          <w:bCs/>
+        </w:rPr>
+        <w:t>Hint</w:t>
+      </w:r>
+      <w:r>
+        <w:t>: The text generation can stop mid-sentence, since the limit is set to maximum 256 tokens.</w:t>
+      </w:r>
+    </w:p>
+    <w:p>
+      <w:pPr>
+        <w:rPr>
+          <w:b/>
+          <w:i/>
+          <w:sz w:val="32"/>
+          <w:szCs w:val="32"/>
+        </w:rPr>
+      </w:pPr>
+      <w:r>
+        <w:rPr>
+          <w:b/>
+          <w:i/>
+          <w:sz w:val="32"/>
+          <w:szCs w:val="32"/>
+        </w:rPr>
+        <w:t>Run the full model and copy the story that has been generated:</w:t>
+      </w:r>
+    </w:p>
+    <w:p>
+      <w:pPr>
+        <w:rPr>
+          <w:color w:val="FF0000"/>
+        </w:rPr>
+      </w:pPr>
+      <w:r>
+        <w:rPr>
+          <w:b/>
+          <w:color w:val="FF0000"/>
+          <w:sz w:val="32"/>
+          <w:szCs w:val="32"/>
+        </w:rPr>
+        <w:t>[Your answer here]</w:t>
+      </w:r>
+    </w:p>
     <w:sectPr>
-      <w:headerReference w:type="even" r:id="rId22"/>
-      <w:headerReference w:type="default" r:id="rId23"/>
-      <w:footerReference w:type="even" r:id="rId24"/>
-      <w:footerReference w:type="default" r:id="rId25"/>
-      <w:headerReference w:type="first" r:id="rId26"/>
-      <w:footerReference w:type="first" r:id="rId27"/>
+      <w:headerReference w:type="even" r:id="rId14"/>
+      <w:headerReference w:type="default" r:id="rId15"/>
+      <w:footerReference w:type="even" r:id="rId16"/>
+      <w:footerReference w:type="default" r:id="rId17"/>
+      <w:headerReference w:type="first" r:id="rId18"/>
+      <w:footerReference w:type="first" r:id="rId19"/>
       <w:pgSz w:w="12240" w:h="15840"/>
       <w:pgMar w:top="1440" w:right="1440" w:bottom="1440" w:left="1440" w:header="0" w:footer="720" w:gutter="0"/>
       <w:pgNumType w:start="1"/>
@@ -4442,7 +4266,7 @@
 
 <file path=word/webextensions/taskpanes.xml><?xml version="1.0" encoding="utf-8"?>
 <wetp:taskpanes xmlns:wetp="http://schemas.microsoft.com/office/webextensions/taskpanes/2010/11">
-  <wetp:taskpane dockstate="right" visibility="0" width="350" row="0">
+  <wetp:taskpane dockstate="right" visibility="0" width="438" row="0">
     <wetp:webextensionref xmlns:r="http://schemas.openxmlformats.org/officeDocument/2006/relationships" r:id="rId1"/>
   </wetp:taskpane>
 </wetp:taskpanes>

</xml_diff>